<commit_message>
feat: updates COST TOKENS Agent && hours ME(DEVELOPER)
</commit_message>
<xml_diff>
--- a/Capitulo1_Tesis_Final.docx
+++ b/Capitulo1_Tesis_Final.docx
@@ -1,6 +1,6 @@
 
 <file path=word/document.xml><?xml version="1.0" encoding="utf-8"?>
-<w:document xmlns:wpc="http://schemas.microsoft.com/office/word/2010/wordprocessingCanvas" xmlns:cx="http://schemas.microsoft.com/office/drawing/2014/chartex" xmlns:cx1="http://schemas.microsoft.com/office/drawing/2015/9/8/chartex" xmlns:cx2="http://schemas.microsoft.com/office/drawing/2015/10/21/chartex" xmlns:cx3="http://schemas.microsoft.com/office/drawing/2016/5/9/chartex" xmlns:cx4="http://schemas.microsoft.com/office/drawing/2016/5/10/chartex" xmlns:cx5="http://schemas.microsoft.com/office/drawing/2016/5/11/chartex" xmlns:cx6="http://schemas.microsoft.com/office/drawing/2016/5/12/chartex" xmlns:cx7="http://schemas.microsoft.com/office/drawing/2016/5/13/chartex" xmlns:cx8="http://schemas.microsoft.com/office/drawing/2016/5/14/chartex" xmlns:mc="http://schemas.openxmlformats.org/markup-compatibility/2006" xmlns:aink="http://schemas.microsoft.com/office/drawing/2016/ink" xmlns:am3d="http://schemas.microsoft.com/office/drawing/2017/model3d" xmlns:o="urn:schemas-microsoft-com:office:office" xmlns:oel="http://schemas.microsoft.com/office/2019/extlst" xmlns:r="http://schemas.openxmlformats.org/officeDocument/2006/relationships" xmlns:m="http://schemas.openxmlformats.org/officeDocument/2006/math" xmlns:v="urn:schemas-microsoft-com:vml" xmlns:wp14="http://schemas.microsoft.com/office/word/2010/wordprocessingDrawing" xmlns:wp="http://schemas.openxmlformats.org/drawingml/2006/wordprocessingDrawing" xmlns:w10="urn:schemas-microsoft-com:office:word" xmlns:w="http://schemas.openxmlformats.org/wordprocessingml/2006/main" xmlns:w14="http://schemas.microsoft.com/office/word/2010/wordml" xmlns:w15="http://schemas.microsoft.com/office/word/2012/wordml" xmlns:w16cex="http://schemas.microsoft.com/office/word/2018/wordml/cex" xmlns:w16cid="http://schemas.microsoft.com/office/word/2016/wordml/cid" xmlns:w16="http://schemas.microsoft.com/office/word/2018/wordml" xmlns:w16du="http://schemas.microsoft.com/office/word/2023/wordml/word16du" xmlns:w16sdtdh="http://schemas.microsoft.com/office/word/2020/wordml/sdtdatahash" xmlns:w16sdtfl="http://schemas.microsoft.com/office/word/2024/wordml/sdtformatlock" xmlns:w16se="http://schemas.microsoft.com/office/word/2015/wordml/symex" xmlns:wpg="http://schemas.microsoft.com/office/word/2010/wordprocessingGroup" xmlns:wpi="http://schemas.microsoft.com/office/word/2010/wordprocessingInk" xmlns:wne="http://schemas.microsoft.com/office/word/2006/wordml" xmlns:wps="http://schemas.microsoft.com/office/word/2010/wordprocessingShape" mc:Ignorable="w14 w15 w16se w16cid w16 w16cex w16sdtdh w16sdtfl w16du wp14">
+<w:document xmlns:wpc="http://schemas.microsoft.com/office/word/2010/wordprocessingCanvas" xmlns:cx="http://schemas.microsoft.com/office/drawing/2014/chartex" xmlns:cx1="http://schemas.microsoft.com/office/drawing/2015/9/8/chartex" xmlns:cx2="http://schemas.microsoft.com/office/drawing/2015/10/21/chartex" xmlns:cx3="http://schemas.microsoft.com/office/drawing/2016/5/9/chartex" xmlns:cx4="http://schemas.microsoft.com/office/drawing/2016/5/10/chartex" xmlns:cx5="http://schemas.microsoft.com/office/drawing/2016/5/11/chartex" xmlns:cx6="http://schemas.microsoft.com/office/drawing/2016/5/12/chartex" xmlns:cx7="http://schemas.microsoft.com/office/drawing/2016/5/13/chartex" xmlns:cx8="http://schemas.microsoft.com/office/drawing/2016/5/14/chartex" xmlns:mc="http://schemas.openxmlformats.org/markup-compatibility/2006" xmlns:aink="http://schemas.microsoft.com/office/drawing/2016/ink" xmlns:am3d="http://schemas.microsoft.com/office/drawing/2017/model3d" xmlns:o="urn:schemas-microsoft-com:office:office" xmlns:r="http://schemas.openxmlformats.org/officeDocument/2006/relationships" xmlns:m="http://schemas.openxmlformats.org/officeDocument/2006/math" xmlns:v="urn:schemas-microsoft-com:vml" xmlns:wp14="http://schemas.microsoft.com/office/word/2010/wordprocessingDrawing" xmlns:wp="http://schemas.openxmlformats.org/drawingml/2006/wordprocessingDrawing" xmlns:w10="urn:schemas-microsoft-com:office:word" xmlns:w="http://schemas.openxmlformats.org/wordprocessingml/2006/main" xmlns:w14="http://schemas.microsoft.com/office/word/2010/wordml" xmlns:w15="http://schemas.microsoft.com/office/word/2012/wordml" xmlns:w16cex="http://schemas.microsoft.com/office/word/2018/wordml/cex" xmlns:w16cid="http://schemas.microsoft.com/office/word/2016/wordml/cid" xmlns:w16="http://schemas.microsoft.com/office/word/2018/wordml" xmlns:w16sdtdh="http://schemas.microsoft.com/office/word/2020/wordml/sdtdatahash" xmlns:w16se="http://schemas.microsoft.com/office/word/2015/wordml/symex" xmlns:wpg="http://schemas.microsoft.com/office/word/2010/wordprocessingGroup" xmlns:wpi="http://schemas.microsoft.com/office/word/2010/wordprocessingInk" xmlns:wne="http://schemas.microsoft.com/office/word/2006/wordml" xmlns:wps="http://schemas.microsoft.com/office/word/2010/wordprocessingShape" mc:Ignorable="w14 w15 w16se w16cid w16 w16cex w16sdtdh wp14">
   <w:body>
     <w:p>
       <w:pPr>
@@ -449,7 +449,34 @@
         <w:fldChar w:fldCharType="separate"/>
       </w:r>
       <w:r>
-        <w:pict w14:anchorId="4BF23CD5">
+        <w:fldChar w:fldCharType="begin"/>
+      </w:r>
+      <w:r>
+        <w:instrText xml:space="preserve"> INCLUDEPICTURE  "http://ile.pe/wp-content/uploads/2016/01/logo-upc.jpg" \* MERGEFORMATINET </w:instrText>
+      </w:r>
+      <w:r>
+        <w:fldChar w:fldCharType="separate"/>
+      </w:r>
+      <w:r>
+        <w:fldChar w:fldCharType="begin"/>
+      </w:r>
+      <w:r>
+        <w:instrText xml:space="preserve"> </w:instrText>
+      </w:r>
+      <w:r>
+        <w:instrText>INCLUDEPICTURE  "http://ile.pe/</w:instrText>
+      </w:r>
+      <w:r>
+        <w:instrText>wp-content/uploads/2016/01/logo-upc.jpg" \* MERGEFORMATINET</w:instrText>
+      </w:r>
+      <w:r>
+        <w:instrText xml:space="preserve"> </w:instrText>
+      </w:r>
+      <w:r>
+        <w:fldChar w:fldCharType="separate"/>
+      </w:r>
+      <w:r>
+        <w:pict w14:anchorId="35499D20">
           <v:shapetype id="_x0000_t75" coordsize="21600,21600" o:spt="75" o:preferrelative="t" path="m@4@5l@4@11@9@11@9@5xe" filled="f" stroked="f">
             <v:stroke joinstyle="miter"/>
             <v:formulas>
@@ -621,6 +648,12 @@
       <w:r>
         <w:fldChar w:fldCharType="end"/>
       </w:r>
+      <w:r>
+        <w:fldChar w:fldCharType="end"/>
+      </w:r>
+      <w:r>
+        <w:fldChar w:fldCharType="end"/>
+      </w:r>
     </w:p>
     <w:p>
       <w:pPr>
@@ -673,6 +706,7 @@
         <w15:color w:val="000000"/>
         <w:text/>
       </w:sdtPr>
+      <w:sdtEndPr/>
       <w:sdtContent>
         <w:p>
           <w:pPr>
@@ -737,6 +771,7 @@
         <w15:color w:val="000000"/>
         <w:text/>
       </w:sdtPr>
+      <w:sdtEndPr/>
       <w:sdtContent>
         <w:p>
           <w:pPr>
@@ -827,6 +862,7 @@
         <w15:color w:val="000000"/>
         <w:text/>
       </w:sdtPr>
+      <w:sdtEndPr/>
       <w:sdtContent>
         <w:p>
           <w:pPr>
@@ -873,6 +909,7 @@
         </w:placeholder>
         <w15:appearance w15:val="hidden"/>
       </w:sdtPr>
+      <w:sdtEndPr/>
       <w:sdtContent>
         <w:p>
           <w:pPr>
@@ -944,7 +981,21 @@
         <w:rPr>
           <w:lang w:val="es-ES"/>
         </w:rPr>
-        <w:t xml:space="preserve"> Sebasthian Enrique</w:t>
+        <w:t xml:space="preserve"> </w:t>
+      </w:r>
+      <w:proofErr w:type="spellStart"/>
+      <w:r>
+        <w:rPr>
+          <w:lang w:val="es-ES"/>
+        </w:rPr>
+        <w:t>Sebasthian</w:t>
+      </w:r>
+      <w:proofErr w:type="spellEnd"/>
+      <w:r>
+        <w:rPr>
+          <w:lang w:val="es-ES"/>
+        </w:rPr>
+        <w:t xml:space="preserve"> Enrique</w:t>
       </w:r>
       <w:r>
         <w:rPr>
@@ -961,14 +1012,12 @@
           <w:lang w:val="es-ES"/>
         </w:rPr>
       </w:pPr>
-      <w:proofErr w:type="spellStart"/>
       <w:r>
         <w:rPr>
           <w:lang w:val="es-ES"/>
         </w:rPr>
         <w:t>Julon</w:t>
       </w:r>
-      <w:proofErr w:type="spellEnd"/>
       <w:r>
         <w:rPr>
           <w:lang w:val="es-ES"/>
@@ -987,14 +1036,12 @@
         </w:rPr>
         <w:t xml:space="preserve">, </w:t>
       </w:r>
-      <w:proofErr w:type="spellStart"/>
       <w:r>
         <w:rPr>
           <w:lang w:val="es-ES"/>
         </w:rPr>
         <w:t>Sebastian</w:t>
       </w:r>
-      <w:proofErr w:type="spellEnd"/>
       <w:r>
         <w:rPr>
           <w:lang w:val="es-ES"/>
@@ -1025,6 +1072,7 @@
         </w:placeholder>
         <w15:appearance w15:val="hidden"/>
       </w:sdtPr>
+      <w:sdtEndPr/>
       <w:sdtContent>
         <w:p>
           <w:pPr>
@@ -1679,21 +1727,7 @@
         <w:rPr>
           <w:lang w:val="es-ES"/>
         </w:rPr>
-        <w:t xml:space="preserve">Los estándares actuales de competitividad de las diversas industrias exigen que se cuente con herramientas de inteligencia artificial que ayuden a reducir la carga de trabajo, agilizando el tiempo que se demora en realizar diversos procesos. En el sector educativo universitario aún se sigue optando por la generación manual de material educativo para cursos virtuales, es decir, varios grupos de profesores se reúnen durante semanas para generar contenido didáctico para los estudiantes. Sin embargo, esto enfrenta un cuello de botella operativo, ya que recae en un docente </w:t>
-      </w:r>
-      <w:proofErr w:type="spellStart"/>
-      <w:r>
-        <w:rPr>
-          <w:lang w:val="es-ES"/>
-        </w:rPr>
-        <w:t>virtualizador</w:t>
-      </w:r>
-      <w:proofErr w:type="spellEnd"/>
-      <w:r>
-        <w:rPr>
-          <w:lang w:val="es-ES"/>
-        </w:rPr>
-        <w:t xml:space="preserve">, quien digita manualmente introducciones, guiones para videos de presentación, entre otras tareas, asegurando que todo quede correcto y tardando mucho tiempo. </w:t>
+        <w:t xml:space="preserve">Los estándares actuales de competitividad de las diversas industrias exigen que se cuente con herramientas de inteligencia artificial que ayuden a reducir la carga de trabajo, agilizando el tiempo que se demora en realizar diversos procesos. En el sector educativo universitario aún se sigue optando por la generación manual de material educativo para cursos virtuales, es decir, varios grupos de profesores se reúnen durante semanas para generar contenido didáctico para los estudiantes. Sin embargo, esto enfrenta un cuello de botella operativo, ya que recae en un docente virtualizador, quien digita manualmente introducciones, guiones para videos de presentación, entre otras tareas, asegurando que todo quede correcto y tardando mucho tiempo. </w:t>
       </w:r>
     </w:p>
     <w:p>
@@ -1881,6 +1915,7 @@
           </w:placeholder>
           <w15:appearance w15:val="hidden"/>
         </w:sdtPr>
+        <w:sdtEndPr/>
         <w:sdtContent>
           <w:r>
             <w:rPr>
@@ -1989,6 +2024,7 @@
           </w:placeholder>
           <w15:appearance w15:val="hidden"/>
         </w:sdtPr>
+        <w:sdtEndPr/>
         <w:sdtContent>
           <w:r>
             <w:rPr>
@@ -2167,6 +2203,7 @@
           </w:placeholder>
           <w15:appearance w15:val="hidden"/>
         </w:sdtPr>
+        <w:sdtEndPr/>
         <w:sdtContent>
           <w:r>
             <w:rPr>
@@ -3842,23 +3879,7 @@
             <w:noProof/>
             <w:lang w:val="es-PE"/>
           </w:rPr>
-          <w:t>Tabla 8 Proyección de costos d</w:t>
-        </w:r>
-        <w:r>
-          <w:rPr>
-            <w:rStyle w:val="Hipervnculo"/>
-            <w:noProof/>
-            <w:lang w:val="es-PE"/>
-          </w:rPr>
-          <w:t>e</w:t>
-        </w:r>
-        <w:r>
-          <w:rPr>
-            <w:rStyle w:val="Hipervnculo"/>
-            <w:noProof/>
-            <w:lang w:val="es-PE"/>
-          </w:rPr>
-          <w:t xml:space="preserve"> dispositivos de trabajo</w:t>
+          <w:t>Tabla 8 Proyección de costos de dispositivos de trabajo</w:t>
         </w:r>
         <w:r>
           <w:rPr>
@@ -4623,49 +4644,21 @@
         <w:rPr>
           <w:lang w:val="es-PE"/>
         </w:rPr>
-        <w:t xml:space="preserve">En el ámbito de la educación virtual, la institución cuenta con un proceso estructurado de producción de cursos denominado virtualización, que comprende la definición del diseño instruccional, la redacción del contenido textual por semana académica y la posterior producción de los recursos multimedia. Dentro de este proceso, el docente </w:t>
-      </w:r>
-      <w:proofErr w:type="spellStart"/>
-      <w:r>
+        <w:t>En el ámbito de la educación virtual, la institución cuenta con un proceso estructurado de producción de cursos denominado virtualización, que comprende la definición del diseño instruccional, la redacción del contenido textual por semana académica y la posterior producción de los recursos multimedia. Dentro de este proceso, el docente virtualizador es el profesional encargado de redactar los materiales instruccionales denominados IPES (Introducción, Presentaciones y Ejercicios), que constituyen el contenido textual base de cada semana del curso.</w:t>
+      </w:r>
+    </w:p>
+    <w:p>
+      <w:pPr>
+        <w:spacing w:after="120"/>
         <w:rPr>
           <w:lang w:val="es-PE"/>
         </w:rPr>
-        <w:t>virtualizador</w:t>
-      </w:r>
-      <w:proofErr w:type="spellEnd"/>
+      </w:pPr>
       <w:r>
         <w:rPr>
           <w:lang w:val="es-PE"/>
         </w:rPr>
-        <w:t xml:space="preserve"> es el profesional encargado de redactar los materiales instruccionales denominados IPES (Introducción, Presentaciones y Ejercicios), que constituyen el contenido textual base de cada semana del curso.</w:t>
-      </w:r>
-    </w:p>
-    <w:p>
-      <w:pPr>
-        <w:spacing w:after="120"/>
-        <w:rPr>
-          <w:lang w:val="es-PE"/>
-        </w:rPr>
-      </w:pPr>
-      <w:r>
-        <w:rPr>
-          <w:lang w:val="es-PE"/>
-        </w:rPr>
-        <w:t xml:space="preserve">El proceso de producción de un curso completo de 18 semanas toma en promedio entre dos y tres semanas de trabajo, durante las cuales el docente </w:t>
-      </w:r>
-      <w:proofErr w:type="spellStart"/>
-      <w:r>
-        <w:rPr>
-          <w:lang w:val="es-PE"/>
-        </w:rPr>
-        <w:t>virtualizador</w:t>
-      </w:r>
-      <w:proofErr w:type="spellEnd"/>
-      <w:r>
-        <w:rPr>
-          <w:lang w:val="es-PE"/>
-        </w:rPr>
-        <w:t xml:space="preserve"> genera los guiones de narración para los recursos de video, las introducciones a cada semana y las consignas de los ejercicios y actividades, tanto calificadas como no calificadas. La institución establece criterios pedagógicos precisos para este contenido, incluyendo la alineación con los logros </w:t>
+        <w:t xml:space="preserve">El proceso de producción de un curso completo de 18 semanas toma en promedio entre dos y tres semanas de trabajo, durante las cuales el docente virtualizador genera los guiones de narración para los recursos de video, las introducciones a cada semana y las consignas de los ejercicios y actividades, tanto calificadas como no calificadas. La institución establece criterios pedagógicos precisos para este contenido, incluyendo la alineación con los logros </w:t>
       </w:r>
       <w:r>
         <w:rPr>
@@ -4696,21 +4689,7 @@
         <w:rPr>
           <w:lang w:val="es-PE"/>
         </w:rPr>
-        <w:t xml:space="preserve">La demora en la gestión de contenido y materiales de los cursos virtuales en la institución constituye el problema central identificado. La producción de material educativo para los cursos virtuales enfrenta un cuello de botella operativo: la redacción de los materiales instruccionales de cada semana académica recae sobre el docente </w:t>
-      </w:r>
-      <w:proofErr w:type="spellStart"/>
-      <w:r>
-        <w:rPr>
-          <w:lang w:val="es-PE"/>
-        </w:rPr>
-        <w:t>virtualizador</w:t>
-      </w:r>
-      <w:proofErr w:type="spellEnd"/>
-      <w:r>
-        <w:rPr>
-          <w:lang w:val="es-PE"/>
-        </w:rPr>
-        <w:t>, un profesional especializado que escribe manualmente las introducciones, guiones de narración para videos de presentación y consignas de actividades, asegurando que cada pieza esté alineada a los logros de aprendizaje del curso. Esta situación se origina en las siguientes causas:</w:t>
+        <w:t>La demora en la gestión de contenido y materiales de los cursos virtuales en la institución constituye el problema central identificado. La producción de material educativo para los cursos virtuales enfrenta un cuello de botella operativo: la redacción de los materiales instruccionales de cada semana académica recae sobre el docente virtualizador, un profesional especializado que escribe manualmente las introducciones, guiones de narración para videos de presentación y consignas de actividades, asegurando que cada pieza esté alineada a los logros de aprendizaje del curso. Esta situación se origina en las siguientes causas:</w:t>
       </w:r>
     </w:p>
     <w:p>
@@ -4731,21 +4710,7 @@
         <w:rPr>
           <w:lang w:val="es-PE"/>
         </w:rPr>
-        <w:t xml:space="preserve">El proceso depende exclusivamente de la disponibilidad y capacidad del docente </w:t>
-      </w:r>
-      <w:proofErr w:type="spellStart"/>
-      <w:r>
-        <w:rPr>
-          <w:lang w:val="es-PE"/>
-        </w:rPr>
-        <w:t>virtualizador</w:t>
-      </w:r>
-      <w:proofErr w:type="spellEnd"/>
-      <w:r>
-        <w:rPr>
-          <w:lang w:val="es-PE"/>
-        </w:rPr>
-        <w:t>, lo que hace que la producción de un curso completo tome en promedio entre dos y tres semanas. Esto limita la capacidad institucional de escalar la oferta académica virtual frente a una demanda creciente.</w:t>
+        <w:t>El proceso depende exclusivamente de la disponibilidad y capacidad del docente virtualizador, lo que hace que la producción de un curso completo tome en promedio entre dos y tres semanas. Esto limita la capacidad institucional de escalar la oferta académica virtual frente a una demanda creciente.</w:t>
       </w:r>
     </w:p>
     <w:p>
@@ -4766,21 +4731,7 @@
         <w:rPr>
           <w:lang w:val="es-PE"/>
         </w:rPr>
-        <w:t xml:space="preserve">Al remunerar al docente </w:t>
-      </w:r>
-      <w:proofErr w:type="spellStart"/>
-      <w:r>
-        <w:rPr>
-          <w:lang w:val="es-PE"/>
-        </w:rPr>
-        <w:t>virtualizador</w:t>
-      </w:r>
-      <w:proofErr w:type="spellEnd"/>
-      <w:r>
-        <w:rPr>
-          <w:lang w:val="es-PE"/>
-        </w:rPr>
-        <w:t xml:space="preserve"> por horas trabajadas, el gasto de producción aumenta proporcionalmente con la cantidad de cursos, sin que exista actualmente un mecanismo que permita reducir esa carga sin comprometer la calidad del contenido.</w:t>
+        <w:t>Al remunerar al docente virtualizador por horas trabajadas, el gasto de producción aumenta proporcionalmente con la cantidad de cursos, sin que exista actualmente un mecanismo que permita reducir esa carga sin comprometer la calidad del contenido.</w:t>
       </w:r>
     </w:p>
     <w:p>
@@ -4886,19 +4837,44 @@
             <w:shd w:val="clear" w:color="auto" w:fill="1F3864"/>
           </w:tcPr>
           <w:p>
+            <w:proofErr w:type="spellStart"/>
             <w:r>
               <w:rPr>
                 <w:b/>
                 <w:color w:val="FFFFFF"/>
               </w:rPr>
-              <w:t xml:space="preserve">Tiempo / Costo </w:t>
-            </w:r>
-            <w:proofErr w:type="spellStart"/>
+              <w:t>Tiempo</w:t>
+            </w:r>
+            <w:proofErr w:type="spellEnd"/>
             <w:r>
               <w:rPr>
                 <w:b/>
                 <w:color w:val="FFFFFF"/>
               </w:rPr>
+              <w:t xml:space="preserve"> / </w:t>
+            </w:r>
+            <w:proofErr w:type="spellStart"/>
+            <w:r>
+              <w:rPr>
+                <w:b/>
+                <w:color w:val="FFFFFF"/>
+              </w:rPr>
+              <w:t>Costo</w:t>
+            </w:r>
+            <w:proofErr w:type="spellEnd"/>
+            <w:r>
+              <w:rPr>
+                <w:b/>
+                <w:color w:val="FFFFFF"/>
+              </w:rPr>
+              <w:t xml:space="preserve"> </w:t>
+            </w:r>
+            <w:proofErr w:type="spellStart"/>
+            <w:r>
+              <w:rPr>
+                <w:b/>
+                <w:color w:val="FFFFFF"/>
+              </w:rPr>
               <w:t>estimado</w:t>
             </w:r>
             <w:proofErr w:type="spellEnd"/>
@@ -4937,15 +4913,7 @@
             </w:r>
             <w:proofErr w:type="spellEnd"/>
             <w:r>
-              <w:t xml:space="preserve"> </w:t>
-            </w:r>
-            <w:proofErr w:type="spellStart"/>
-            <w:r>
-              <w:t>virtualizador</w:t>
-            </w:r>
-            <w:proofErr w:type="spellEnd"/>
-            <w:r>
-              <w:t>)</w:t>
+              <w:t xml:space="preserve"> virtualizador)</w:t>
             </w:r>
           </w:p>
         </w:tc>
@@ -5016,34 +4984,34 @@
               </w:rPr>
             </w:pPr>
             <w:r>
+              <w:t>~$0.040 USD por curso (IPES)</w:t>
+            </w:r>
+          </w:p>
+          <w:p>
+            <w:r>
+              <w:lastRenderedPageBreak/>
+              <w:t xml:space="preserve">~$0.087 USD por curso (flujo </w:t>
+            </w:r>
+            <w:r>
+              <w:t>completo + consignas)</w:t>
+            </w:r>
+          </w:p>
+        </w:tc>
+        <w:tc>
+          <w:tcPr>
+            <w:tcW w:w="2942" w:type="dxa"/>
+          </w:tcPr>
+          <w:p>
+            <w:pPr>
               <w:rPr>
                 <w:lang w:val="es-PE"/>
               </w:rPr>
-              <w:t>~$0.025 USD por curso (IPES)</w:t>
-            </w:r>
+            </w:pPr>
             <w:r>
               <w:rPr>
                 <w:lang w:val="es-PE"/>
               </w:rPr>
-              <w:br/>
-              <w:t>~$0.064 USD por curso (flujo completo)</w:t>
-            </w:r>
-          </w:p>
-        </w:tc>
-        <w:tc>
-          <w:tcPr>
-            <w:tcW w:w="2942" w:type="dxa"/>
-          </w:tcPr>
-          <w:p>
-            <w:pPr>
-              <w:rPr>
-                <w:lang w:val="es-PE"/>
-              </w:rPr>
-            </w:pPr>
-            <w:r>
-              <w:rPr>
-                <w:lang w:val="es-PE"/>
-              </w:rPr>
+              <w:lastRenderedPageBreak/>
               <w:t>Costo fijo por ejecución, independiente del número de cursos procesados en paralelo.</w:t>
             </w:r>
           </w:p>
@@ -5061,36 +5029,7 @@
         <w:rPr>
           <w:lang w:val="es-PE"/>
         </w:rPr>
-        <w:lastRenderedPageBreak/>
-        <w:t xml:space="preserve">Los costos presentados se basan en datos reales obtenidos del registro de tokens del sistema, </w:t>
-      </w:r>
-      <w:proofErr w:type="spellStart"/>
-      <w:r>
-        <w:rPr>
-          <w:lang w:val="es-PE"/>
-        </w:rPr>
-        <w:t>token_usage.jsonl</w:t>
-      </w:r>
-      <w:proofErr w:type="spellEnd"/>
-      <w:r>
-        <w:rPr>
-          <w:lang w:val="es-PE"/>
-        </w:rPr>
-        <w:t xml:space="preserve">, correspondientes a 566 llamadas de ejecución. El costo de 0.025 USD corresponde únicamente a la generación de materiales IPES, introducción, presentaciones y ejercicios. El costo de 0.064 USD incluye adicionalmente la generación del material base de referencia, </w:t>
-      </w:r>
-      <w:proofErr w:type="spellStart"/>
-      <w:r>
-        <w:rPr>
-          <w:lang w:val="es-PE"/>
-        </w:rPr>
-        <w:t>genera_material_base</w:t>
-      </w:r>
-      <w:proofErr w:type="spellEnd"/>
-      <w:r>
-        <w:rPr>
-          <w:lang w:val="es-PE"/>
-        </w:rPr>
-        <w:t>, que es opcional en el flujo de producción.</w:t>
+        <w:t>Nota: Los costos presentados se basan en datos reales obtenidos del sistema (debug/tokens_summary.json), correspondientes a 1 896 llamadas de ejecución. El costo de $0.040 USD corresponde únicamente a la generación de materiales IPES (introducción, presentaciones y ejercicios). El costo de $0.087 USD incluye adicionalmente la generación del material base (genera_material_base) y las consignas de actividades (rúbrica y escala de valoración).</w:t>
       </w:r>
     </w:p>
     <w:p>
@@ -5306,21 +5245,7 @@
               <w:rPr>
                 <w:lang w:val="es-PE"/>
               </w:rPr>
-              <w:t xml:space="preserve">• Dependencia exclusiva del docente </w:t>
-            </w:r>
-            <w:proofErr w:type="spellStart"/>
-            <w:r>
-              <w:rPr>
-                <w:lang w:val="es-PE"/>
-              </w:rPr>
-              <w:t>virtualizador</w:t>
-            </w:r>
-            <w:proofErr w:type="spellEnd"/>
-            <w:r>
-              <w:rPr>
-                <w:lang w:val="es-PE"/>
-              </w:rPr>
-              <w:t xml:space="preserve"> para producir el contenido semanal.</w:t>
+              <w:t>• Dependencia exclusiva del docente virtualizador para producir el contenido semanal.</w:t>
             </w:r>
             <w:r>
               <w:rPr>
@@ -5358,14 +5283,8 @@
         <w:rPr>
           <w:lang w:val="es-PE"/>
         </w:rPr>
-        <w:t xml:space="preserve">Desde el punto de vista de la Ingeniería de Sistemas de Información, este problema se traduce en la necesidad de diseñar e implementar una solución basada en agentes de inteligencia artificial que automatice y estructure la fase de generación de contenido textual, reduciendo la dependencia del factor humano en las tareas repetitivas del proceso de virtualización y </w:t>
-      </w:r>
-      <w:r>
-        <w:rPr>
-          <w:lang w:val="es-PE"/>
-        </w:rPr>
         <w:lastRenderedPageBreak/>
-        <w:t>permitiendo escalar la producción de cursos sin incrementar proporcionalmente los costos operativos.</w:t>
+        <w:t>Desde el punto de vista de la Ingeniería de Sistemas de Información, este problema se traduce en la necesidad de diseñar e implementar una solución basada en agentes de inteligencia artificial que automatice y estructure la fase de generación de contenido textual, reduciendo la dependencia del factor humano en las tareas repetitivas del proceso de virtualización y permitiendo escalar la producción de cursos sin incrementar proporcionalmente los costos operativos.</w:t>
       </w:r>
     </w:p>
     <w:p>
@@ -5787,7 +5706,14 @@
               <w:rPr>
                 <w:lang w:val="es-PE"/>
               </w:rPr>
-              <w:t>Aprobación por el asesor académico del análisis de tecnologías, herramientas y enfoques de IA para la generación de contenido instruccional.</w:t>
+              <w:t xml:space="preserve">Aprobación por el asesor académico del análisis de tecnologías, herramientas y enfoques de IA para la </w:t>
+            </w:r>
+            <w:r>
+              <w:rPr>
+                <w:lang w:val="es-PE"/>
+              </w:rPr>
+              <w:lastRenderedPageBreak/>
+              <w:t>generación de contenido instruccional.</w:t>
             </w:r>
           </w:p>
         </w:tc>
@@ -5797,6 +5723,7 @@
           </w:tcPr>
           <w:p>
             <w:r>
+              <w:lastRenderedPageBreak/>
               <w:t>OE1</w:t>
             </w:r>
           </w:p>
@@ -5827,14 +5754,7 @@
               <w:rPr>
                 <w:lang w:val="es-PE"/>
               </w:rPr>
-              <w:t xml:space="preserve">Aprobación por el asesor académico de la arquitectura </w:t>
-            </w:r>
-            <w:r>
-              <w:rPr>
-                <w:lang w:val="es-PE"/>
-              </w:rPr>
-              <w:lastRenderedPageBreak/>
-              <w:t>de agentes diseñada para las fases de diseño, aseguramiento y generación de contenido.</w:t>
+              <w:t>Aprobación por el asesor académico de la arquitectura de agentes diseñada para las fases de diseño, aseguramiento y generación de contenido.</w:t>
             </w:r>
           </w:p>
         </w:tc>
@@ -5844,7 +5764,6 @@
           </w:tcPr>
           <w:p>
             <w:r>
-              <w:lastRenderedPageBreak/>
               <w:t>OE2</w:t>
             </w:r>
           </w:p>
@@ -6196,7 +6115,14 @@
               <w:rPr>
                 <w:lang w:val="es-PE"/>
               </w:rPr>
-              <w:t>OE1: Analizar la solución tecnológica basada en IA para la generación de contenido.</w:t>
+              <w:t xml:space="preserve">OE1: Analizar la solución tecnológica basada en IA para la </w:t>
+            </w:r>
+            <w:r>
+              <w:rPr>
+                <w:lang w:val="es-PE"/>
+              </w:rPr>
+              <w:lastRenderedPageBreak/>
+              <w:t>generación de contenido.</w:t>
             </w:r>
           </w:p>
         </w:tc>
@@ -6214,7 +6140,15 @@
               <w:rPr>
                 <w:lang w:val="es-PE"/>
               </w:rPr>
-              <w:t>Revisión sistemática de literatura y análisis comparativo de tecnologías LLM aplicadas a generación de contenido instruccional.</w:t>
+              <w:lastRenderedPageBreak/>
+              <w:t xml:space="preserve">Revisión sistemática de literatura y análisis comparativo de tecnologías LLM </w:t>
+            </w:r>
+            <w:r>
+              <w:rPr>
+                <w:lang w:val="es-PE"/>
+              </w:rPr>
+              <w:lastRenderedPageBreak/>
+              <w:t>aplicadas a generación de contenido instruccional.</w:t>
             </w:r>
           </w:p>
         </w:tc>
@@ -6224,6 +6158,7 @@
           </w:tcPr>
           <w:p>
             <w:r>
+              <w:lastRenderedPageBreak/>
               <w:t>IE1</w:t>
             </w:r>
           </w:p>
@@ -6262,7 +6197,6 @@
               <w:rPr>
                 <w:lang w:val="es-PE"/>
               </w:rPr>
-              <w:lastRenderedPageBreak/>
               <w:t>OE2: Diseñar la arquitectura de la solución tecnológica.</w:t>
             </w:r>
           </w:p>
@@ -6613,19 +6547,14 @@
         <w:rPr>
           <w:lang w:val="es-PE"/>
         </w:rPr>
-        <w:t xml:space="preserve"> de pago por uso. A </w:t>
+        <w:t xml:space="preserve"> de pago por uso. A continuación, se detallan los precios de los modelos utilizados, el costo </w:t>
       </w:r>
       <w:r>
         <w:rPr>
           <w:lang w:val="es-PE"/>
         </w:rPr>
-        <w:t>continuación,</w:t>
-      </w:r>
-      <w:r>
-        <w:rPr>
-          <w:lang w:val="es-PE"/>
-        </w:rPr>
-        <w:t xml:space="preserve"> se detallan los precios de los modelos utilizados, el costo por componente del proceso y el costo total estimado por curso generado, con base en datos reales de ejecución del sistema.</w:t>
+        <w:lastRenderedPageBreak/>
+        <w:t>por componente del proceso y el costo total estimado por curso generado, con base en datos reales de ejecución del sistema.</w:t>
       </w:r>
     </w:p>
     <w:p>
@@ -6719,7 +6648,6 @@
                 <w:b/>
                 <w:color w:val="FFFFFF"/>
               </w:rPr>
-              <w:lastRenderedPageBreak/>
               <w:t>Modelo</w:t>
             </w:r>
           </w:p>
@@ -6905,21 +6833,7 @@
                 <w:b/>
                 <w:bCs/>
               </w:rPr>
-              <w:t>$1.</w:t>
-            </w:r>
-            <w:r>
-              <w:rPr>
-                <w:b/>
-                <w:bCs/>
-              </w:rPr>
-              <w:t>9</w:t>
-            </w:r>
-            <w:r>
-              <w:rPr>
-                <w:b/>
-                <w:bCs/>
-              </w:rPr>
-              <w:t>0 USD</w:t>
+              <w:t>$1.90 USD</w:t>
             </w:r>
           </w:p>
         </w:tc>
@@ -7043,47 +6957,61 @@
         <w:tblLook w:val="04A0" w:firstRow="1" w:lastRow="0" w:firstColumn="1" w:lastColumn="0" w:noHBand="0" w:noVBand="1"/>
       </w:tblPr>
       <w:tblGrid>
-        <w:gridCol w:w="3014"/>
-        <w:gridCol w:w="2907"/>
-        <w:gridCol w:w="2856"/>
+        <w:gridCol w:w="3668"/>
+        <w:gridCol w:w="1683"/>
+        <w:gridCol w:w="1100"/>
+        <w:gridCol w:w="1083"/>
+        <w:gridCol w:w="1243"/>
       </w:tblGrid>
       <w:tr>
         <w:tc>
           <w:tcPr>
-            <w:tcW w:w="3033" w:type="dxa"/>
+            <w:tcW w:w="2800" w:type="dxa"/>
             <w:shd w:val="clear" w:color="auto" w:fill="1F3864"/>
           </w:tcPr>
           <w:p>
-            <w:proofErr w:type="spellStart"/>
             <w:r>
               <w:rPr>
                 <w:b/>
                 <w:color w:val="FFFFFF"/>
               </w:rPr>
-              <w:t>Componente</w:t>
-            </w:r>
-            <w:proofErr w:type="spellEnd"/>
+              <w:t>Componente / Agente</w:t>
+            </w:r>
+          </w:p>
+        </w:tc>
+        <w:tc>
+          <w:tcPr>
+            <w:tcW w:w="1450" w:type="dxa"/>
+            <w:shd w:val="clear" w:color="auto" w:fill="1F3864"/>
+          </w:tcPr>
+          <w:p>
             <w:r>
               <w:rPr>
                 <w:b/>
                 <w:color w:val="FFFFFF"/>
               </w:rPr>
-              <w:t xml:space="preserve"> / </w:t>
-            </w:r>
-            <w:proofErr w:type="spellStart"/>
+              <w:t>Fase</w:t>
+            </w:r>
+          </w:p>
+        </w:tc>
+        <w:tc>
+          <w:tcPr>
+            <w:tcW w:w="1500" w:type="dxa"/>
+            <w:shd w:val="clear" w:color="auto" w:fill="1F3864"/>
+          </w:tcPr>
+          <w:p>
             <w:r>
               <w:rPr>
                 <w:b/>
                 <w:color w:val="FFFFFF"/>
               </w:rPr>
-              <w:t>Agente</w:t>
-            </w:r>
-            <w:proofErr w:type="spellEnd"/>
-          </w:p>
-        </w:tc>
-        <w:tc>
-          <w:tcPr>
-            <w:tcW w:w="3033" w:type="dxa"/>
+              <w:t>Tokens entrada</w:t>
+            </w:r>
+          </w:p>
+        </w:tc>
+        <w:tc>
+          <w:tcPr>
+            <w:tcW w:w="1500" w:type="dxa"/>
             <w:shd w:val="clear" w:color="auto" w:fill="1F3864"/>
           </w:tcPr>
           <w:p>
@@ -7092,13 +7020,13 @@
                 <w:b/>
                 <w:color w:val="FFFFFF"/>
               </w:rPr>
-              <w:t>Fase</w:t>
-            </w:r>
-          </w:p>
-        </w:tc>
-        <w:tc>
-          <w:tcPr>
-            <w:tcW w:w="3033" w:type="dxa"/>
+              <w:t>Tokens salida</w:t>
+            </w:r>
+          </w:p>
+        </w:tc>
+        <w:tc>
+          <w:tcPr>
+            <w:tcW w:w="1750" w:type="dxa"/>
             <w:shd w:val="clear" w:color="auto" w:fill="1F3864"/>
           </w:tcPr>
           <w:p>
@@ -7107,23 +7035,7 @@
                 <w:b/>
                 <w:color w:val="FFFFFF"/>
               </w:rPr>
-              <w:t xml:space="preserve">Costo </w:t>
-            </w:r>
-            <w:proofErr w:type="spellStart"/>
-            <w:r>
-              <w:rPr>
-                <w:b/>
-                <w:color w:val="FFFFFF"/>
-              </w:rPr>
-              <w:t>estimado</w:t>
-            </w:r>
-            <w:proofErr w:type="spellEnd"/>
-            <w:r>
-              <w:rPr>
-                <w:b/>
-                <w:color w:val="FFFFFF"/>
-              </w:rPr>
-              <w:t xml:space="preserve"> (USD)</w:t>
+              <w:t>Costo estimado (USD)</w:t>
             </w:r>
           </w:p>
         </w:tc>
@@ -7131,63 +7043,51 @@
       <w:tr>
         <w:tc>
           <w:tcPr>
-            <w:tcW w:w="3033" w:type="dxa"/>
-          </w:tcPr>
-          <w:p>
-            <w:pPr>
-              <w:rPr>
-                <w:lang w:val="es-PE"/>
-              </w:rPr>
-            </w:pPr>
-            <w:proofErr w:type="spellStart"/>
-            <w:r>
-              <w:rPr>
-                <w:lang w:val="es-PE"/>
-              </w:rPr>
-              <w:t>KickOffAgent</w:t>
-            </w:r>
-            <w:proofErr w:type="spellEnd"/>
-            <w:r>
-              <w:rPr>
-                <w:lang w:val="es-PE"/>
-              </w:rPr>
-              <w:t xml:space="preserve"> — </w:t>
-            </w:r>
-            <w:proofErr w:type="spellStart"/>
-            <w:r>
-              <w:rPr>
-                <w:lang w:val="es-PE"/>
-              </w:rPr>
-              <w:t>parseo</w:t>
-            </w:r>
-            <w:proofErr w:type="spellEnd"/>
-            <w:r>
-              <w:rPr>
-                <w:lang w:val="es-PE"/>
-              </w:rPr>
-              <w:t xml:space="preserve"> del acta de inicio</w:t>
-            </w:r>
-          </w:p>
-        </w:tc>
-        <w:tc>
-          <w:tcPr>
-            <w:tcW w:w="3033" w:type="dxa"/>
-          </w:tcPr>
-          <w:p>
-            <w:proofErr w:type="spellStart"/>
+            <w:tcW w:w="2800" w:type="dxa"/>
+          </w:tcPr>
+          <w:p>
+            <w:r>
+              <w:t>KickOffAgent – parseo del acta de inicio</w:t>
+            </w:r>
+          </w:p>
+        </w:tc>
+        <w:tc>
+          <w:tcPr>
+            <w:tcW w:w="1450" w:type="dxa"/>
+          </w:tcPr>
+          <w:p>
             <w:r>
               <w:t>Diseño</w:t>
             </w:r>
-            <w:proofErr w:type="spellEnd"/>
-          </w:p>
-        </w:tc>
-        <w:tc>
-          <w:tcPr>
-            <w:tcW w:w="3033" w:type="dxa"/>
-          </w:tcPr>
-          <w:p>
-            <w:r>
-              <w:t>$0.0004</w:t>
+          </w:p>
+        </w:tc>
+        <w:tc>
+          <w:tcPr>
+            <w:tcW w:w="1500" w:type="dxa"/>
+          </w:tcPr>
+          <w:p>
+            <w:r>
+              <w:t>1,542</w:t>
+            </w:r>
+          </w:p>
+        </w:tc>
+        <w:tc>
+          <w:tcPr>
+            <w:tcW w:w="1500" w:type="dxa"/>
+          </w:tcPr>
+          <w:p>
+            <w:r>
+              <w:t>1,882</w:t>
+            </w:r>
+          </w:p>
+        </w:tc>
+        <w:tc>
+          <w:tcPr>
+            <w:tcW w:w="1750" w:type="dxa"/>
+          </w:tcPr>
+          <w:p>
+            <w:r>
+              <w:t>$0.0007</w:t>
             </w:r>
           </w:p>
         </w:tc>
@@ -7195,47 +7095,47 @@
       <w:tr>
         <w:tc>
           <w:tcPr>
-            <w:tcW w:w="3033" w:type="dxa"/>
-          </w:tcPr>
-          <w:p>
-            <w:proofErr w:type="spellStart"/>
-            <w:r>
-              <w:t>CourseSchemaAgent</w:t>
-            </w:r>
-            <w:proofErr w:type="spellEnd"/>
-            <w:r>
-              <w:t xml:space="preserve"> — </w:t>
-            </w:r>
-            <w:proofErr w:type="spellStart"/>
-            <w:r>
-              <w:t>contexto</w:t>
-            </w:r>
-            <w:proofErr w:type="spellEnd"/>
-            <w:r>
-              <w:t xml:space="preserve"> del </w:t>
-            </w:r>
-            <w:proofErr w:type="spellStart"/>
-            <w:r>
-              <w:t>curso</w:t>
-            </w:r>
-            <w:proofErr w:type="spellEnd"/>
-          </w:p>
-        </w:tc>
-        <w:tc>
-          <w:tcPr>
-            <w:tcW w:w="3033" w:type="dxa"/>
-          </w:tcPr>
-          <w:p>
-            <w:proofErr w:type="spellStart"/>
+            <w:tcW w:w="2800" w:type="dxa"/>
+          </w:tcPr>
+          <w:p>
+            <w:r>
+              <w:t>CourseSchemaAgent – contexto del curso</w:t>
+            </w:r>
+          </w:p>
+        </w:tc>
+        <w:tc>
+          <w:tcPr>
+            <w:tcW w:w="1450" w:type="dxa"/>
+          </w:tcPr>
+          <w:p>
             <w:r>
               <w:t>Diseño</w:t>
             </w:r>
-            <w:proofErr w:type="spellEnd"/>
-          </w:p>
-        </w:tc>
-        <w:tc>
-          <w:tcPr>
-            <w:tcW w:w="3033" w:type="dxa"/>
+          </w:p>
+        </w:tc>
+        <w:tc>
+          <w:tcPr>
+            <w:tcW w:w="1500" w:type="dxa"/>
+          </w:tcPr>
+          <w:p>
+            <w:r>
+              <w:t>594</w:t>
+            </w:r>
+          </w:p>
+        </w:tc>
+        <w:tc>
+          <w:tcPr>
+            <w:tcW w:w="1500" w:type="dxa"/>
+          </w:tcPr>
+          <w:p>
+            <w:r>
+              <w:t>155</w:t>
+            </w:r>
+          </w:p>
+        </w:tc>
+        <w:tc>
+          <w:tcPr>
+            <w:tcW w:w="1750" w:type="dxa"/>
           </w:tcPr>
           <w:p>
             <w:r>
@@ -7247,59 +7147,51 @@
       <w:tr>
         <w:tc>
           <w:tcPr>
-            <w:tcW w:w="3033" w:type="dxa"/>
-          </w:tcPr>
-          <w:p>
-            <w:proofErr w:type="spellStart"/>
-            <w:r>
-              <w:t>UniteSchemaSubAgent</w:t>
-            </w:r>
-            <w:proofErr w:type="spellEnd"/>
-            <w:r>
-              <w:t xml:space="preserve"> — </w:t>
-            </w:r>
-            <w:proofErr w:type="spellStart"/>
-            <w:r>
-              <w:t>esquema</w:t>
-            </w:r>
-            <w:proofErr w:type="spellEnd"/>
-            <w:r>
-              <w:t xml:space="preserve"> </w:t>
-            </w:r>
-            <w:proofErr w:type="spellStart"/>
-            <w:r>
-              <w:t>por</w:t>
-            </w:r>
-            <w:proofErr w:type="spellEnd"/>
-            <w:r>
-              <w:t xml:space="preserve"> </w:t>
-            </w:r>
-            <w:proofErr w:type="spellStart"/>
-            <w:r>
-              <w:t>unidad</w:t>
-            </w:r>
-            <w:proofErr w:type="spellEnd"/>
-          </w:p>
-        </w:tc>
-        <w:tc>
-          <w:tcPr>
-            <w:tcW w:w="3033" w:type="dxa"/>
-          </w:tcPr>
-          <w:p>
-            <w:proofErr w:type="spellStart"/>
+            <w:tcW w:w="2800" w:type="dxa"/>
+          </w:tcPr>
+          <w:p>
+            <w:r>
+              <w:t>UniteSchemaSubAgent – esquema por unidad</w:t>
+            </w:r>
+          </w:p>
+        </w:tc>
+        <w:tc>
+          <w:tcPr>
+            <w:tcW w:w="1450" w:type="dxa"/>
+          </w:tcPr>
+          <w:p>
             <w:r>
               <w:t>Diseño</w:t>
             </w:r>
-            <w:proofErr w:type="spellEnd"/>
-          </w:p>
-        </w:tc>
-        <w:tc>
-          <w:tcPr>
-            <w:tcW w:w="3033" w:type="dxa"/>
-          </w:tcPr>
-          <w:p>
-            <w:r>
-              <w:t>$0.0037</w:t>
+          </w:p>
+        </w:tc>
+        <w:tc>
+          <w:tcPr>
+            <w:tcW w:w="1500" w:type="dxa"/>
+          </w:tcPr>
+          <w:p>
+            <w:r>
+              <w:t>4,546</w:t>
+            </w:r>
+          </w:p>
+        </w:tc>
+        <w:tc>
+          <w:tcPr>
+            <w:tcW w:w="1500" w:type="dxa"/>
+          </w:tcPr>
+          <w:p>
+            <w:r>
+              <w:t>15,416</w:t>
+            </w:r>
+          </w:p>
+        </w:tc>
+        <w:tc>
+          <w:tcPr>
+            <w:tcW w:w="1750" w:type="dxa"/>
+          </w:tcPr>
+          <w:p>
+            <w:r>
+              <w:t>$0.0050</w:t>
             </w:r>
           </w:p>
         </w:tc>
@@ -7307,43 +7199,51 @@
       <w:tr>
         <w:tc>
           <w:tcPr>
-            <w:tcW w:w="3033" w:type="dxa"/>
-          </w:tcPr>
-          <w:p>
-            <w:proofErr w:type="spellStart"/>
-            <w:r>
-              <w:t>SyllabusActivityClassifier</w:t>
-            </w:r>
-            <w:proofErr w:type="spellEnd"/>
-            <w:r>
-              <w:t xml:space="preserve"> — </w:t>
-            </w:r>
-            <w:proofErr w:type="spellStart"/>
-            <w:r>
-              <w:t>clasificación</w:t>
-            </w:r>
-            <w:proofErr w:type="spellEnd"/>
-          </w:p>
-        </w:tc>
-        <w:tc>
-          <w:tcPr>
-            <w:tcW w:w="3033" w:type="dxa"/>
-          </w:tcPr>
-          <w:p>
-            <w:proofErr w:type="spellStart"/>
+            <w:tcW w:w="2800" w:type="dxa"/>
+          </w:tcPr>
+          <w:p>
+            <w:r>
+              <w:t>SyllabusActivityClassifier – clasificación</w:t>
+            </w:r>
+          </w:p>
+        </w:tc>
+        <w:tc>
+          <w:tcPr>
+            <w:tcW w:w="1450" w:type="dxa"/>
+          </w:tcPr>
+          <w:p>
             <w:r>
               <w:t>Diseño</w:t>
             </w:r>
-            <w:proofErr w:type="spellEnd"/>
-          </w:p>
-        </w:tc>
-        <w:tc>
-          <w:tcPr>
-            <w:tcW w:w="3033" w:type="dxa"/>
-          </w:tcPr>
-          <w:p>
-            <w:r>
-              <w:t>$0.0017</w:t>
+          </w:p>
+        </w:tc>
+        <w:tc>
+          <w:tcPr>
+            <w:tcW w:w="1500" w:type="dxa"/>
+          </w:tcPr>
+          <w:p>
+            <w:r>
+              <w:t>7,367</w:t>
+            </w:r>
+          </w:p>
+        </w:tc>
+        <w:tc>
+          <w:tcPr>
+            <w:tcW w:w="1500" w:type="dxa"/>
+          </w:tcPr>
+          <w:p>
+            <w:r>
+              <w:t>4,076</w:t>
+            </w:r>
+          </w:p>
+        </w:tc>
+        <w:tc>
+          <w:tcPr>
+            <w:tcW w:w="1750" w:type="dxa"/>
+          </w:tcPr>
+          <w:p>
+            <w:r>
+              <w:t>$0.0018</w:t>
             </w:r>
           </w:p>
         </w:tc>
@@ -7351,43 +7251,51 @@
       <w:tr>
         <w:tc>
           <w:tcPr>
-            <w:tcW w:w="3033" w:type="dxa"/>
-          </w:tcPr>
-          <w:p>
-            <w:proofErr w:type="spellStart"/>
-            <w:r>
-              <w:t>UniteSchemaSubAgent</w:t>
-            </w:r>
-            <w:proofErr w:type="spellEnd"/>
-            <w:r>
-              <w:t xml:space="preserve"> — </w:t>
-            </w:r>
-            <w:proofErr w:type="spellStart"/>
-            <w:r>
-              <w:t>actividades</w:t>
-            </w:r>
-            <w:proofErr w:type="spellEnd"/>
-          </w:p>
-        </w:tc>
-        <w:tc>
-          <w:tcPr>
-            <w:tcW w:w="3033" w:type="dxa"/>
-          </w:tcPr>
-          <w:p>
-            <w:proofErr w:type="spellStart"/>
+            <w:tcW w:w="2800" w:type="dxa"/>
+          </w:tcPr>
+          <w:p>
+            <w:r>
+              <w:t>UniteSchemaSubAgent – actividades</w:t>
+            </w:r>
+          </w:p>
+        </w:tc>
+        <w:tc>
+          <w:tcPr>
+            <w:tcW w:w="1450" w:type="dxa"/>
+          </w:tcPr>
+          <w:p>
             <w:r>
               <w:t>Diseño</w:t>
             </w:r>
-            <w:proofErr w:type="spellEnd"/>
-          </w:p>
-        </w:tc>
-        <w:tc>
-          <w:tcPr>
-            <w:tcW w:w="3033" w:type="dxa"/>
-          </w:tcPr>
-          <w:p>
-            <w:r>
-              <w:t>$0.0019</w:t>
+          </w:p>
+        </w:tc>
+        <w:tc>
+          <w:tcPr>
+            <w:tcW w:w="1500" w:type="dxa"/>
+          </w:tcPr>
+          <w:p>
+            <w:r>
+              <w:t>9,993</w:t>
+            </w:r>
+          </w:p>
+        </w:tc>
+        <w:tc>
+          <w:tcPr>
+            <w:tcW w:w="1500" w:type="dxa"/>
+          </w:tcPr>
+          <w:p>
+            <w:r>
+              <w:t>4,994</w:t>
+            </w:r>
+          </w:p>
+        </w:tc>
+        <w:tc>
+          <w:tcPr>
+            <w:tcW w:w="1750" w:type="dxa"/>
+          </w:tcPr>
+          <w:p>
+            <w:r>
+              <w:t>$0.0022</w:t>
             </w:r>
           </w:p>
         </w:tc>
@@ -7395,30 +7303,17 @@
       <w:tr>
         <w:tc>
           <w:tcPr>
-            <w:tcW w:w="3033" w:type="dxa"/>
-          </w:tcPr>
-          <w:p>
-            <w:proofErr w:type="spellStart"/>
-            <w:r>
-              <w:t>IpesAgent</w:t>
-            </w:r>
-            <w:proofErr w:type="spellEnd"/>
-            <w:r>
-              <w:t xml:space="preserve"> — </w:t>
-            </w:r>
-            <w:proofErr w:type="spellStart"/>
-            <w:r>
-              <w:t>one_step_schema_recursos</w:t>
-            </w:r>
-            <w:proofErr w:type="spellEnd"/>
-            <w:r>
-              <w:t xml:space="preserve"> (18 sem.)</w:t>
-            </w:r>
-          </w:p>
-        </w:tc>
-        <w:tc>
-          <w:tcPr>
-            <w:tcW w:w="3033" w:type="dxa"/>
+            <w:tcW w:w="2800" w:type="dxa"/>
+          </w:tcPr>
+          <w:p>
+            <w:r>
+              <w:t>IpesAgent – one_step_schema_recursos (18 sem.)</w:t>
+            </w:r>
+          </w:p>
+        </w:tc>
+        <w:tc>
+          <w:tcPr>
+            <w:tcW w:w="1450" w:type="dxa"/>
           </w:tcPr>
           <w:p>
             <w:r>
@@ -7428,11 +7323,31 @@
         </w:tc>
         <w:tc>
           <w:tcPr>
-            <w:tcW w:w="3033" w:type="dxa"/>
-          </w:tcPr>
-          <w:p>
-            <w:r>
-              <w:t>$0.0045</w:t>
+            <w:tcW w:w="1500" w:type="dxa"/>
+          </w:tcPr>
+          <w:p>
+            <w:r>
+              <w:t>69,251</w:t>
+            </w:r>
+          </w:p>
+        </w:tc>
+        <w:tc>
+          <w:tcPr>
+            <w:tcW w:w="1500" w:type="dxa"/>
+          </w:tcPr>
+          <w:p>
+            <w:r>
+              <w:t>39,134</w:t>
+            </w:r>
+          </w:p>
+        </w:tc>
+        <w:tc>
+          <w:tcPr>
+            <w:tcW w:w="1750" w:type="dxa"/>
+          </w:tcPr>
+          <w:p>
+            <w:r>
+              <w:t>$0.0169</w:t>
             </w:r>
           </w:p>
         </w:tc>
@@ -7440,30 +7355,18 @@
       <w:tr>
         <w:tc>
           <w:tcPr>
-            <w:tcW w:w="3033" w:type="dxa"/>
-          </w:tcPr>
-          <w:p>
-            <w:proofErr w:type="spellStart"/>
-            <w:r>
-              <w:t>IpesAgent</w:t>
-            </w:r>
-            <w:proofErr w:type="spellEnd"/>
-            <w:r>
-              <w:t xml:space="preserve"> — </w:t>
-            </w:r>
-            <w:proofErr w:type="spellStart"/>
-            <w:r>
-              <w:t>one_step_introduccion</w:t>
-            </w:r>
-            <w:proofErr w:type="spellEnd"/>
-            <w:r>
-              <w:t xml:space="preserve"> (18 sem.)</w:t>
-            </w:r>
-          </w:p>
-        </w:tc>
-        <w:tc>
-          <w:tcPr>
-            <w:tcW w:w="3033" w:type="dxa"/>
+            <w:tcW w:w="2800" w:type="dxa"/>
+          </w:tcPr>
+          <w:p>
+            <w:r>
+              <w:lastRenderedPageBreak/>
+              <w:t>IpesAgent – one_step_introduccion (18 sem.)</w:t>
+            </w:r>
+          </w:p>
+        </w:tc>
+        <w:tc>
+          <w:tcPr>
+            <w:tcW w:w="1450" w:type="dxa"/>
           </w:tcPr>
           <w:p>
             <w:r>
@@ -7473,11 +7376,31 @@
         </w:tc>
         <w:tc>
           <w:tcPr>
-            <w:tcW w:w="3033" w:type="dxa"/>
-          </w:tcPr>
-          <w:p>
-            <w:r>
-              <w:t>$0.0043</w:t>
+            <w:tcW w:w="1500" w:type="dxa"/>
+          </w:tcPr>
+          <w:p>
+            <w:r>
+              <w:t>22,482</w:t>
+            </w:r>
+          </w:p>
+        </w:tc>
+        <w:tc>
+          <w:tcPr>
+            <w:tcW w:w="1500" w:type="dxa"/>
+          </w:tcPr>
+          <w:p>
+            <w:r>
+              <w:t>10,046</w:t>
+            </w:r>
+          </w:p>
+        </w:tc>
+        <w:tc>
+          <w:tcPr>
+            <w:tcW w:w="1750" w:type="dxa"/>
+          </w:tcPr>
+          <w:p>
+            <w:r>
+              <w:t>$0.0047</w:t>
             </w:r>
           </w:p>
         </w:tc>
@@ -7485,31 +7408,17 @@
       <w:tr>
         <w:tc>
           <w:tcPr>
-            <w:tcW w:w="3033" w:type="dxa"/>
-          </w:tcPr>
-          <w:p>
-            <w:proofErr w:type="spellStart"/>
-            <w:r>
-              <w:lastRenderedPageBreak/>
-              <w:t>IpesAgent</w:t>
-            </w:r>
-            <w:proofErr w:type="spellEnd"/>
-            <w:r>
-              <w:t xml:space="preserve"> — </w:t>
-            </w:r>
-            <w:proofErr w:type="spellStart"/>
-            <w:r>
-              <w:t>one_step_presentaciones</w:t>
-            </w:r>
-            <w:proofErr w:type="spellEnd"/>
-            <w:r>
-              <w:t xml:space="preserve"> (18 sem.)</w:t>
-            </w:r>
-          </w:p>
-        </w:tc>
-        <w:tc>
-          <w:tcPr>
-            <w:tcW w:w="3033" w:type="dxa"/>
+            <w:tcW w:w="2800" w:type="dxa"/>
+          </w:tcPr>
+          <w:p>
+            <w:r>
+              <w:t>IpesAgent – one_step_presentaciones (18 sem.)</w:t>
+            </w:r>
+          </w:p>
+        </w:tc>
+        <w:tc>
+          <w:tcPr>
+            <w:tcW w:w="1450" w:type="dxa"/>
           </w:tcPr>
           <w:p>
             <w:r>
@@ -7519,11 +7428,31 @@
         </w:tc>
         <w:tc>
           <w:tcPr>
-            <w:tcW w:w="3033" w:type="dxa"/>
-          </w:tcPr>
-          <w:p>
-            <w:r>
-              <w:t>$0.0053</w:t>
+            <w:tcW w:w="1500" w:type="dxa"/>
+          </w:tcPr>
+          <w:p>
+            <w:r>
+              <w:t>26,737</w:t>
+            </w:r>
+          </w:p>
+        </w:tc>
+        <w:tc>
+          <w:tcPr>
+            <w:tcW w:w="1500" w:type="dxa"/>
+          </w:tcPr>
+          <w:p>
+            <w:r>
+              <w:t>12,793</w:t>
+            </w:r>
+          </w:p>
+        </w:tc>
+        <w:tc>
+          <w:tcPr>
+            <w:tcW w:w="1750" w:type="dxa"/>
+          </w:tcPr>
+          <w:p>
+            <w:r>
+              <w:t>$0.0058</w:t>
             </w:r>
           </w:p>
         </w:tc>
@@ -7531,30 +7460,17 @@
       <w:tr>
         <w:tc>
           <w:tcPr>
-            <w:tcW w:w="3033" w:type="dxa"/>
-          </w:tcPr>
-          <w:p>
-            <w:proofErr w:type="spellStart"/>
-            <w:r>
-              <w:t>IpesAgent</w:t>
-            </w:r>
-            <w:proofErr w:type="spellEnd"/>
-            <w:r>
-              <w:t xml:space="preserve"> — </w:t>
-            </w:r>
-            <w:proofErr w:type="spellStart"/>
-            <w:r>
-              <w:t>one_step_ejercicios</w:t>
-            </w:r>
-            <w:proofErr w:type="spellEnd"/>
-            <w:r>
-              <w:t xml:space="preserve"> (18 sem.)</w:t>
-            </w:r>
-          </w:p>
-        </w:tc>
-        <w:tc>
-          <w:tcPr>
-            <w:tcW w:w="3033" w:type="dxa"/>
+            <w:tcW w:w="2800" w:type="dxa"/>
+          </w:tcPr>
+          <w:p>
+            <w:r>
+              <w:t>IpesAgent – one_step_ejercicios (18 sem.)</w:t>
+            </w:r>
+          </w:p>
+        </w:tc>
+        <w:tc>
+          <w:tcPr>
+            <w:tcW w:w="1450" w:type="dxa"/>
           </w:tcPr>
           <w:p>
             <w:r>
@@ -7564,7 +7480,27 @@
         </w:tc>
         <w:tc>
           <w:tcPr>
-            <w:tcW w:w="3033" w:type="dxa"/>
+            <w:tcW w:w="1500" w:type="dxa"/>
+          </w:tcPr>
+          <w:p>
+            <w:r>
+              <w:t>19,050</w:t>
+            </w:r>
+          </w:p>
+        </w:tc>
+        <w:tc>
+          <w:tcPr>
+            <w:tcW w:w="1500" w:type="dxa"/>
+          </w:tcPr>
+          <w:p>
+            <w:r>
+              <w:t>4,346</w:t>
+            </w:r>
+          </w:p>
+        </w:tc>
+        <w:tc>
+          <w:tcPr>
+            <w:tcW w:w="1750" w:type="dxa"/>
           </w:tcPr>
           <w:p>
             <w:r>
@@ -7576,39 +7512,47 @@
       <w:tr>
         <w:tc>
           <w:tcPr>
-            <w:tcW w:w="3033" w:type="dxa"/>
-          </w:tcPr>
-          <w:p>
-            <w:proofErr w:type="spellStart"/>
-            <w:r>
-              <w:t>CheckIpesAgent</w:t>
-            </w:r>
-            <w:proofErr w:type="spellEnd"/>
-            <w:r>
-              <w:t xml:space="preserve"> — QA del </w:t>
-            </w:r>
-            <w:proofErr w:type="spellStart"/>
-            <w:r>
-              <w:t>contenido</w:t>
-            </w:r>
-            <w:proofErr w:type="spellEnd"/>
-          </w:p>
-        </w:tc>
-        <w:tc>
-          <w:tcPr>
-            <w:tcW w:w="3033" w:type="dxa"/>
-          </w:tcPr>
-          <w:p>
-            <w:proofErr w:type="spellStart"/>
+            <w:tcW w:w="2800" w:type="dxa"/>
+          </w:tcPr>
+          <w:p>
+            <w:r>
+              <w:t>CheckIpesAgent – QA del contenido</w:t>
+            </w:r>
+          </w:p>
+        </w:tc>
+        <w:tc>
+          <w:tcPr>
+            <w:tcW w:w="1450" w:type="dxa"/>
+          </w:tcPr>
+          <w:p>
             <w:r>
               <w:t>Aseguramiento</w:t>
             </w:r>
-            <w:proofErr w:type="spellEnd"/>
-          </w:p>
-        </w:tc>
-        <w:tc>
-          <w:tcPr>
-            <w:tcW w:w="3033" w:type="dxa"/>
+          </w:p>
+        </w:tc>
+        <w:tc>
+          <w:tcPr>
+            <w:tcW w:w="1500" w:type="dxa"/>
+          </w:tcPr>
+          <w:p>
+            <w:r>
+              <w:t>1,011</w:t>
+            </w:r>
+          </w:p>
+        </w:tc>
+        <w:tc>
+          <w:tcPr>
+            <w:tcW w:w="1500" w:type="dxa"/>
+          </w:tcPr>
+          <w:p>
+            <w:r>
+              <w:t>304</w:t>
+            </w:r>
+          </w:p>
+        </w:tc>
+        <w:tc>
+          <w:tcPr>
+            <w:tcW w:w="1750" w:type="dxa"/>
           </w:tcPr>
           <w:p>
             <w:r>
@@ -7620,58 +7564,225 @@
       <w:tr>
         <w:tc>
           <w:tcPr>
-            <w:tcW w:w="3033" w:type="dxa"/>
-          </w:tcPr>
-          <w:p>
-            <w:pPr>
-              <w:rPr>
-                <w:lang w:val="es-PE"/>
-              </w:rPr>
-            </w:pPr>
+            <w:tcW w:w="2800" w:type="dxa"/>
+          </w:tcPr>
+          <w:p>
+            <w:r>
+              <w:t>ContentGenerationAgent – genera_material_base (18 sem.)</w:t>
+            </w:r>
+          </w:p>
+        </w:tc>
+        <w:tc>
+          <w:tcPr>
+            <w:tcW w:w="1450" w:type="dxa"/>
+          </w:tcPr>
+          <w:p>
+            <w:r>
+              <w:t>Generación</w:t>
+            </w:r>
+          </w:p>
+        </w:tc>
+        <w:tc>
+          <w:tcPr>
+            <w:tcW w:w="1500" w:type="dxa"/>
+          </w:tcPr>
+          <w:p>
+            <w:r>
+              <w:t>63,407</w:t>
+            </w:r>
+          </w:p>
+        </w:tc>
+        <w:tc>
+          <w:tcPr>
+            <w:tcW w:w="1500" w:type="dxa"/>
+          </w:tcPr>
+          <w:p>
+            <w:r>
+              <w:t>110,503</w:t>
+            </w:r>
+          </w:p>
+        </w:tc>
+        <w:tc>
+          <w:tcPr>
+            <w:tcW w:w="1750" w:type="dxa"/>
+          </w:tcPr>
+          <w:p>
+            <w:r>
+              <w:t>$0.0379</w:t>
+            </w:r>
+          </w:p>
+        </w:tc>
+      </w:tr>
+      <w:tr>
+        <w:tc>
+          <w:tcPr>
+            <w:tcW w:w="2800" w:type="dxa"/>
+          </w:tcPr>
+          <w:p>
+            <w:r>
+              <w:t>RubricGenerationAgent – genera_consigna_rúbrica (sem. seleccionadas)</w:t>
+            </w:r>
+          </w:p>
+        </w:tc>
+        <w:tc>
+          <w:tcPr>
+            <w:tcW w:w="1450" w:type="dxa"/>
+          </w:tcPr>
+          <w:p>
+            <w:r>
+              <w:t>Generación</w:t>
+            </w:r>
+          </w:p>
+        </w:tc>
+        <w:tc>
+          <w:tcPr>
+            <w:tcW w:w="1500" w:type="dxa"/>
+          </w:tcPr>
+          <w:p>
+            <w:r>
+              <w:t>20,806</w:t>
+            </w:r>
+          </w:p>
+        </w:tc>
+        <w:tc>
+          <w:tcPr>
+            <w:tcW w:w="1500" w:type="dxa"/>
+          </w:tcPr>
+          <w:p>
+            <w:r>
+              <w:t>19,628</w:t>
+            </w:r>
+          </w:p>
+        </w:tc>
+        <w:tc>
+          <w:tcPr>
+            <w:tcW w:w="1750" w:type="dxa"/>
+          </w:tcPr>
+          <w:p>
+            <w:r>
+              <w:t>$0.0074</w:t>
+            </w:r>
+          </w:p>
+        </w:tc>
+      </w:tr>
+      <w:tr>
+        <w:tc>
+          <w:tcPr>
+            <w:tcW w:w="2800" w:type="dxa"/>
+          </w:tcPr>
+          <w:p>
+            <w:r>
+              <w:t>RubricGenerationAgent – genera_consigna_escala_valoración (sem. seleccionadas)</w:t>
+            </w:r>
+          </w:p>
+        </w:tc>
+        <w:tc>
+          <w:tcPr>
+            <w:tcW w:w="1450" w:type="dxa"/>
+          </w:tcPr>
+          <w:p>
+            <w:r>
+              <w:t>Generación</w:t>
+            </w:r>
+          </w:p>
+        </w:tc>
+        <w:tc>
+          <w:tcPr>
+            <w:tcW w:w="1500" w:type="dxa"/>
+          </w:tcPr>
+          <w:p>
+            <w:r>
+              <w:t>6,922</w:t>
+            </w:r>
+          </w:p>
+        </w:tc>
+        <w:tc>
+          <w:tcPr>
+            <w:tcW w:w="1500" w:type="dxa"/>
+          </w:tcPr>
+          <w:p>
+            <w:r>
+              <w:t>4,098</w:t>
+            </w:r>
+          </w:p>
+        </w:tc>
+        <w:tc>
+          <w:tcPr>
+            <w:tcW w:w="1750" w:type="dxa"/>
+          </w:tcPr>
+          <w:p>
+            <w:r>
+              <w:t>$0.0017</w:t>
+            </w:r>
+          </w:p>
+        </w:tc>
+      </w:tr>
+      <w:tr>
+        <w:tc>
+          <w:tcPr>
+            <w:tcW w:w="2800" w:type="dxa"/>
+          </w:tcPr>
+          <w:p>
             <w:r>
               <w:rPr>
                 <w:b/>
-                <w:lang w:val="es-PE"/>
-              </w:rPr>
-              <w:t>Costo total</w:t>
+              </w:rPr>
+              <w:t xml:space="preserve">Costo total flujo completo (con </w:t>
             </w:r>
             <w:r>
               <w:rPr>
                 <w:b/>
-                <w:lang w:val="es-PE"/>
-              </w:rPr>
-              <w:t xml:space="preserve"> IPES (sin material base)</w:t>
-            </w:r>
-          </w:p>
-        </w:tc>
-        <w:tc>
-          <w:tcPr>
-            <w:tcW w:w="3033" w:type="dxa"/>
-          </w:tcPr>
-          <w:p>
-            <w:pPr>
-              <w:rPr>
-                <w:lang w:val="es-PE"/>
-              </w:rPr>
-            </w:pPr>
-          </w:p>
-        </w:tc>
-        <w:tc>
-          <w:tcPr>
-            <w:tcW w:w="3033" w:type="dxa"/>
+              </w:rPr>
+              <w:t>generación de contenido + consignas)</w:t>
+            </w:r>
+          </w:p>
+        </w:tc>
+        <w:tc>
+          <w:tcPr>
+            <w:tcW w:w="1450" w:type="dxa"/>
+          </w:tcPr>
+          <w:p/>
+        </w:tc>
+        <w:tc>
+          <w:tcPr>
+            <w:tcW w:w="1500" w:type="dxa"/>
+          </w:tcPr>
+          <w:p/>
+        </w:tc>
+        <w:tc>
+          <w:tcPr>
+            <w:tcW w:w="1500" w:type="dxa"/>
+          </w:tcPr>
+          <w:p/>
+        </w:tc>
+        <w:tc>
+          <w:tcPr>
+            <w:tcW w:w="1750" w:type="dxa"/>
           </w:tcPr>
           <w:p>
             <w:r>
               <w:rPr>
                 <w:b/>
               </w:rPr>
-              <w:t>~$0.025 USD</w:t>
+              <w:t>~$0.087 USD</w:t>
             </w:r>
           </w:p>
         </w:tc>
       </w:tr>
     </w:tbl>
     <w:p>
+      <w:r>
+        <w:t>Tabla 6b Desglose de tokens: generación de contenido + consignas (por curso – 18 semanas)</w:t>
+      </w:r>
+    </w:p>
+    <w:p/>
+    <w:p>
+      <w:r>
+        <w:t>Tabla 6b Desglose de tokens: generación de contenido + consignas (por curso – 18 semanas)</w:t>
+      </w:r>
+    </w:p>
+    <w:p/>
+    <w:p>
       <w:pPr>
         <w:rPr>
           <w:lang w:val="es-PE"/>
@@ -7758,6 +7869,7 @@
           <w:szCs w:val="24"/>
           <w:lang w:val="es-PE"/>
         </w:rPr>
+        <w:lastRenderedPageBreak/>
         <w:t xml:space="preserve">Tabla </w:t>
       </w:r>
       <w:r>
@@ -7914,7 +8026,7 @@
           </w:tcPr>
           <w:p>
             <w:r>
-              <w:t xml:space="preserve">400 </w:t>
+              <w:t xml:space="preserve">520 </w:t>
             </w:r>
             <w:proofErr w:type="spellStart"/>
             <w:r>
@@ -7939,7 +8051,7 @@
           </w:tcPr>
           <w:p>
             <w:r>
-              <w:t>S/. 12,500</w:t>
+              <w:t>S/. 16,250</w:t>
             </w:r>
           </w:p>
         </w:tc>
@@ -8238,7 +8350,7 @@
                 <w:bCs/>
                 <w:lang w:val="en-GB"/>
               </w:rPr>
-              <w:t>S/. 24,250</w:t>
+              <w:t>S/. 28,000</w:t>
             </w:r>
           </w:p>
         </w:tc>
@@ -8246,6 +8358,35 @@
     </w:tbl>
     <w:p>
       <w:pPr>
+        <w:jc w:val="left"/>
+        <w:rPr>
+          <w:strike/>
+        </w:rPr>
+      </w:pPr>
+      <w:r>
+        <w:rPr>
+          <w:i/>
+          <w:strike/>
+        </w:rPr>
+        <w:t xml:space="preserve">Nota: Las horas del Desarrollador IA corresponden al tiempo real invertido en el proyecto desde el </w:t>
+      </w:r>
+      <w:r>
+        <w:rPr>
+          <w:i/>
+          <w:strike/>
+        </w:rPr>
+        <w:t>16 de septiembre de 2025: (1) sep 16 – dic 31, 2025: 15.3 semanas × 12 hrs/sem (30 ■ del tiempo, 70 ■ asignado al programa Salto – UTP) = 183 hrs; (2) ene 1 – feb 28, 2026: 8.4 semanas × 25 hrs/sem (100 ■ enfoque) = 211 hrs; (3) mar 1 – mar 31, 2026: 4.4 s</w:t>
+      </w:r>
+      <w:r>
+        <w:rPr>
+          <w:i/>
+          <w:strike/>
+        </w:rPr>
+        <w:t>emanas × 16 hrs/sem (40 ■ del tiempo) = 71 hrs; (4) abr 1 – abr 15, 2026: 2.1 semanas × 25 hrs/sem (100 ■ enfoque) = 54 hrs. Total acumulado: ~ 520 hrs.</w:t>
+      </w:r>
+    </w:p>
+    <w:p>
+      <w:pPr>
         <w:rPr>
           <w:lang w:val="es-PE"/>
         </w:rPr>
@@ -8264,7 +8405,6 @@
           <w:b/>
           <w:bCs/>
         </w:rPr>
-        <w:lastRenderedPageBreak/>
         <w:t xml:space="preserve">Costo </w:t>
       </w:r>
       <w:r>
@@ -8541,6 +8681,7 @@
                 <w:bCs/>
                 <w:lang w:val="es-PE"/>
               </w:rPr>
+              <w:lastRenderedPageBreak/>
               <w:t>Costo total de dispositivo de trabajo</w:t>
             </w:r>
           </w:p>
@@ -8924,7 +9065,7 @@
               <w:rPr>
                 <w:lang w:val="en-GB"/>
               </w:rPr>
-              <w:t>S/. 24,250</w:t>
+              <w:t>S/. 28,000</w:t>
             </w:r>
           </w:p>
         </w:tc>
@@ -9015,7 +9156,7 @@
                 <w:bCs/>
                 <w:lang w:val="en-GB"/>
               </w:rPr>
-              <w:t>S/. 51,757.12</w:t>
+              <w:t>S/. 55,507.12</w:t>
             </w:r>
           </w:p>
         </w:tc>
@@ -9041,7 +9182,7 @@
 </file>
 
 <file path=word/endnotes.xml><?xml version="1.0" encoding="utf-8"?>
-<w:endnotes xmlns:wpc="http://schemas.microsoft.com/office/word/2010/wordprocessingCanvas" xmlns:cx="http://schemas.microsoft.com/office/drawing/2014/chartex" xmlns:cx1="http://schemas.microsoft.com/office/drawing/2015/9/8/chartex" xmlns:cx2="http://schemas.microsoft.com/office/drawing/2015/10/21/chartex" xmlns:cx3="http://schemas.microsoft.com/office/drawing/2016/5/9/chartex" xmlns:cx4="http://schemas.microsoft.com/office/drawing/2016/5/10/chartex" xmlns:cx5="http://schemas.microsoft.com/office/drawing/2016/5/11/chartex" xmlns:cx6="http://schemas.microsoft.com/office/drawing/2016/5/12/chartex" xmlns:cx7="http://schemas.microsoft.com/office/drawing/2016/5/13/chartex" xmlns:cx8="http://schemas.microsoft.com/office/drawing/2016/5/14/chartex" xmlns:mc="http://schemas.openxmlformats.org/markup-compatibility/2006" xmlns:aink="http://schemas.microsoft.com/office/drawing/2016/ink" xmlns:am3d="http://schemas.microsoft.com/office/drawing/2017/model3d" xmlns:o="urn:schemas-microsoft-com:office:office" xmlns:oel="http://schemas.microsoft.com/office/2019/extlst" xmlns:r="http://schemas.openxmlformats.org/officeDocument/2006/relationships" xmlns:m="http://schemas.openxmlformats.org/officeDocument/2006/math" xmlns:v="urn:schemas-microsoft-com:vml" xmlns:wp14="http://schemas.microsoft.com/office/word/2010/wordprocessingDrawing" xmlns:wp="http://schemas.openxmlformats.org/drawingml/2006/wordprocessingDrawing" xmlns:w10="urn:schemas-microsoft-com:office:word" xmlns:w="http://schemas.openxmlformats.org/wordprocessingml/2006/main" xmlns:w14="http://schemas.microsoft.com/office/word/2010/wordml" xmlns:w15="http://schemas.microsoft.com/office/word/2012/wordml" xmlns:w16cex="http://schemas.microsoft.com/office/word/2018/wordml/cex" xmlns:w16cid="http://schemas.microsoft.com/office/word/2016/wordml/cid" xmlns:w16="http://schemas.microsoft.com/office/word/2018/wordml" xmlns:w16du="http://schemas.microsoft.com/office/word/2023/wordml/word16du" xmlns:w16sdtdh="http://schemas.microsoft.com/office/word/2020/wordml/sdtdatahash" xmlns:w16sdtfl="http://schemas.microsoft.com/office/word/2024/wordml/sdtformatlock" xmlns:w16se="http://schemas.microsoft.com/office/word/2015/wordml/symex" xmlns:wpg="http://schemas.microsoft.com/office/word/2010/wordprocessingGroup" xmlns:wpi="http://schemas.microsoft.com/office/word/2010/wordprocessingInk" xmlns:wne="http://schemas.microsoft.com/office/word/2006/wordml" xmlns:wps="http://schemas.microsoft.com/office/word/2010/wordprocessingShape" mc:Ignorable="w14 w15 w16se w16cid w16 w16cex w16sdtdh w16sdtfl w16du wp14">
+<w:endnotes xmlns:wpc="http://schemas.microsoft.com/office/word/2010/wordprocessingCanvas" xmlns:cx="http://schemas.microsoft.com/office/drawing/2014/chartex" xmlns:cx1="http://schemas.microsoft.com/office/drawing/2015/9/8/chartex" xmlns:cx2="http://schemas.microsoft.com/office/drawing/2015/10/21/chartex" xmlns:cx3="http://schemas.microsoft.com/office/drawing/2016/5/9/chartex" xmlns:cx4="http://schemas.microsoft.com/office/drawing/2016/5/10/chartex" xmlns:cx5="http://schemas.microsoft.com/office/drawing/2016/5/11/chartex" xmlns:cx6="http://schemas.microsoft.com/office/drawing/2016/5/12/chartex" xmlns:cx7="http://schemas.microsoft.com/office/drawing/2016/5/13/chartex" xmlns:cx8="http://schemas.microsoft.com/office/drawing/2016/5/14/chartex" xmlns:mc="http://schemas.openxmlformats.org/markup-compatibility/2006" xmlns:aink="http://schemas.microsoft.com/office/drawing/2016/ink" xmlns:am3d="http://schemas.microsoft.com/office/drawing/2017/model3d" xmlns:o="urn:schemas-microsoft-com:office:office" xmlns:r="http://schemas.openxmlformats.org/officeDocument/2006/relationships" xmlns:m="http://schemas.openxmlformats.org/officeDocument/2006/math" xmlns:v="urn:schemas-microsoft-com:vml" xmlns:wp14="http://schemas.microsoft.com/office/word/2010/wordprocessingDrawing" xmlns:wp="http://schemas.openxmlformats.org/drawingml/2006/wordprocessingDrawing" xmlns:w10="urn:schemas-microsoft-com:office:word" xmlns:w="http://schemas.openxmlformats.org/wordprocessingml/2006/main" xmlns:w14="http://schemas.microsoft.com/office/word/2010/wordml" xmlns:w15="http://schemas.microsoft.com/office/word/2012/wordml" xmlns:w16cex="http://schemas.microsoft.com/office/word/2018/wordml/cex" xmlns:w16cid="http://schemas.microsoft.com/office/word/2016/wordml/cid" xmlns:w16="http://schemas.microsoft.com/office/word/2018/wordml" xmlns:w16sdtdh="http://schemas.microsoft.com/office/word/2020/wordml/sdtdatahash" xmlns:w16se="http://schemas.microsoft.com/office/word/2015/wordml/symex" xmlns:wpg="http://schemas.microsoft.com/office/word/2010/wordprocessingGroup" xmlns:wpi="http://schemas.microsoft.com/office/word/2010/wordprocessingInk" xmlns:wne="http://schemas.microsoft.com/office/word/2006/wordml" xmlns:wps="http://schemas.microsoft.com/office/word/2010/wordprocessingShape" mc:Ignorable="w14 w15 w16se w16cid w16 w16cex w16sdtdh wp14">
   <w:endnote w:type="separator" w:id="-1">
     <w:p>
       <w:pPr>
@@ -9066,7 +9207,7 @@
 </file>
 
 <file path=word/footer1.xml><?xml version="1.0" encoding="utf-8"?>
-<w:ftr xmlns:wpc="http://schemas.microsoft.com/office/word/2010/wordprocessingCanvas" xmlns:cx="http://schemas.microsoft.com/office/drawing/2014/chartex" xmlns:cx1="http://schemas.microsoft.com/office/drawing/2015/9/8/chartex" xmlns:cx2="http://schemas.microsoft.com/office/drawing/2015/10/21/chartex" xmlns:cx3="http://schemas.microsoft.com/office/drawing/2016/5/9/chartex" xmlns:cx4="http://schemas.microsoft.com/office/drawing/2016/5/10/chartex" xmlns:cx5="http://schemas.microsoft.com/office/drawing/2016/5/11/chartex" xmlns:cx6="http://schemas.microsoft.com/office/drawing/2016/5/12/chartex" xmlns:cx7="http://schemas.microsoft.com/office/drawing/2016/5/13/chartex" xmlns:cx8="http://schemas.microsoft.com/office/drawing/2016/5/14/chartex" xmlns:mc="http://schemas.openxmlformats.org/markup-compatibility/2006" xmlns:aink="http://schemas.microsoft.com/office/drawing/2016/ink" xmlns:am3d="http://schemas.microsoft.com/office/drawing/2017/model3d" xmlns:o="urn:schemas-microsoft-com:office:office" xmlns:oel="http://schemas.microsoft.com/office/2019/extlst" xmlns:r="http://schemas.openxmlformats.org/officeDocument/2006/relationships" xmlns:m="http://schemas.openxmlformats.org/officeDocument/2006/math" xmlns:v="urn:schemas-microsoft-com:vml" xmlns:wp14="http://schemas.microsoft.com/office/word/2010/wordprocessingDrawing" xmlns:wp="http://schemas.openxmlformats.org/drawingml/2006/wordprocessingDrawing" xmlns:w10="urn:schemas-microsoft-com:office:word" xmlns:w="http://schemas.openxmlformats.org/wordprocessingml/2006/main" xmlns:w14="http://schemas.microsoft.com/office/word/2010/wordml" xmlns:w15="http://schemas.microsoft.com/office/word/2012/wordml" xmlns:w16cex="http://schemas.microsoft.com/office/word/2018/wordml/cex" xmlns:w16cid="http://schemas.microsoft.com/office/word/2016/wordml/cid" xmlns:w16="http://schemas.microsoft.com/office/word/2018/wordml" xmlns:w16du="http://schemas.microsoft.com/office/word/2023/wordml/word16du" xmlns:w16sdtdh="http://schemas.microsoft.com/office/word/2020/wordml/sdtdatahash" xmlns:w16sdtfl="http://schemas.microsoft.com/office/word/2024/wordml/sdtformatlock" xmlns:w16se="http://schemas.microsoft.com/office/word/2015/wordml/symex" xmlns:wpg="http://schemas.microsoft.com/office/word/2010/wordprocessingGroup" xmlns:wpi="http://schemas.microsoft.com/office/word/2010/wordprocessingInk" xmlns:wne="http://schemas.microsoft.com/office/word/2006/wordml" xmlns:wps="http://schemas.microsoft.com/office/word/2010/wordprocessingShape" mc:Ignorable="w14 w15 w16se w16cid w16 w16cex w16sdtdh w16sdtfl w16du wp14">
+<w:ftr xmlns:wpc="http://schemas.microsoft.com/office/word/2010/wordprocessingCanvas" xmlns:cx="http://schemas.microsoft.com/office/drawing/2014/chartex" xmlns:cx1="http://schemas.microsoft.com/office/drawing/2015/9/8/chartex" xmlns:cx2="http://schemas.microsoft.com/office/drawing/2015/10/21/chartex" xmlns:cx3="http://schemas.microsoft.com/office/drawing/2016/5/9/chartex" xmlns:cx4="http://schemas.microsoft.com/office/drawing/2016/5/10/chartex" xmlns:cx5="http://schemas.microsoft.com/office/drawing/2016/5/11/chartex" xmlns:cx6="http://schemas.microsoft.com/office/drawing/2016/5/12/chartex" xmlns:cx7="http://schemas.microsoft.com/office/drawing/2016/5/13/chartex" xmlns:cx8="http://schemas.microsoft.com/office/drawing/2016/5/14/chartex" xmlns:mc="http://schemas.openxmlformats.org/markup-compatibility/2006" xmlns:aink="http://schemas.microsoft.com/office/drawing/2016/ink" xmlns:am3d="http://schemas.microsoft.com/office/drawing/2017/model3d" xmlns:o="urn:schemas-microsoft-com:office:office" xmlns:r="http://schemas.openxmlformats.org/officeDocument/2006/relationships" xmlns:m="http://schemas.openxmlformats.org/officeDocument/2006/math" xmlns:v="urn:schemas-microsoft-com:vml" xmlns:wp14="http://schemas.microsoft.com/office/word/2010/wordprocessingDrawing" xmlns:wp="http://schemas.openxmlformats.org/drawingml/2006/wordprocessingDrawing" xmlns:w10="urn:schemas-microsoft-com:office:word" xmlns:w="http://schemas.openxmlformats.org/wordprocessingml/2006/main" xmlns:w14="http://schemas.microsoft.com/office/word/2010/wordml" xmlns:w15="http://schemas.microsoft.com/office/word/2012/wordml" xmlns:w16cex="http://schemas.microsoft.com/office/word/2018/wordml/cex" xmlns:w16cid="http://schemas.microsoft.com/office/word/2016/wordml/cid" xmlns:w16="http://schemas.microsoft.com/office/word/2018/wordml" xmlns:w16sdtdh="http://schemas.microsoft.com/office/word/2020/wordml/sdtdatahash" xmlns:w16se="http://schemas.microsoft.com/office/word/2015/wordml/symex" xmlns:wpg="http://schemas.microsoft.com/office/word/2010/wordprocessingGroup" xmlns:wpi="http://schemas.microsoft.com/office/word/2010/wordprocessingInk" xmlns:wne="http://schemas.microsoft.com/office/word/2006/wordml" xmlns:wps="http://schemas.microsoft.com/office/word/2010/wordprocessingShape" mc:Ignorable="w14 w15 w16se w16cid w16 w16cex w16sdtdh wp14">
   <w:sdt>
     <w:sdtPr>
       <w:id w:val="588045748"/>
@@ -9075,6 +9216,7 @@
         <w:docPartUnique/>
       </w:docPartObj>
     </w:sdtPr>
+    <w:sdtEndPr/>
     <w:sdtContent>
       <w:p>
         <w:pPr>
@@ -9111,7 +9253,7 @@
 </file>
 
 <file path=word/footer2.xml><?xml version="1.0" encoding="utf-8"?>
-<w:ftr xmlns:wpc="http://schemas.microsoft.com/office/word/2010/wordprocessingCanvas" xmlns:cx="http://schemas.microsoft.com/office/drawing/2014/chartex" xmlns:cx1="http://schemas.microsoft.com/office/drawing/2015/9/8/chartex" xmlns:cx2="http://schemas.microsoft.com/office/drawing/2015/10/21/chartex" xmlns:cx3="http://schemas.microsoft.com/office/drawing/2016/5/9/chartex" xmlns:cx4="http://schemas.microsoft.com/office/drawing/2016/5/10/chartex" xmlns:cx5="http://schemas.microsoft.com/office/drawing/2016/5/11/chartex" xmlns:cx6="http://schemas.microsoft.com/office/drawing/2016/5/12/chartex" xmlns:cx7="http://schemas.microsoft.com/office/drawing/2016/5/13/chartex" xmlns:cx8="http://schemas.microsoft.com/office/drawing/2016/5/14/chartex" xmlns:mc="http://schemas.openxmlformats.org/markup-compatibility/2006" xmlns:aink="http://schemas.microsoft.com/office/drawing/2016/ink" xmlns:am3d="http://schemas.microsoft.com/office/drawing/2017/model3d" xmlns:o="urn:schemas-microsoft-com:office:office" xmlns:oel="http://schemas.microsoft.com/office/2019/extlst" xmlns:r="http://schemas.openxmlformats.org/officeDocument/2006/relationships" xmlns:m="http://schemas.openxmlformats.org/officeDocument/2006/math" xmlns:v="urn:schemas-microsoft-com:vml" xmlns:wp14="http://schemas.microsoft.com/office/word/2010/wordprocessingDrawing" xmlns:wp="http://schemas.openxmlformats.org/drawingml/2006/wordprocessingDrawing" xmlns:w10="urn:schemas-microsoft-com:office:word" xmlns:w="http://schemas.openxmlformats.org/wordprocessingml/2006/main" xmlns:w14="http://schemas.microsoft.com/office/word/2010/wordml" xmlns:w15="http://schemas.microsoft.com/office/word/2012/wordml" xmlns:w16cex="http://schemas.microsoft.com/office/word/2018/wordml/cex" xmlns:w16cid="http://schemas.microsoft.com/office/word/2016/wordml/cid" xmlns:w16="http://schemas.microsoft.com/office/word/2018/wordml" xmlns:w16du="http://schemas.microsoft.com/office/word/2023/wordml/word16du" xmlns:w16sdtdh="http://schemas.microsoft.com/office/word/2020/wordml/sdtdatahash" xmlns:w16sdtfl="http://schemas.microsoft.com/office/word/2024/wordml/sdtformatlock" xmlns:w16se="http://schemas.microsoft.com/office/word/2015/wordml/symex" xmlns:wpg="http://schemas.microsoft.com/office/word/2010/wordprocessingGroup" xmlns:wpi="http://schemas.microsoft.com/office/word/2010/wordprocessingInk" xmlns:wne="http://schemas.microsoft.com/office/word/2006/wordml" xmlns:wps="http://schemas.microsoft.com/office/word/2010/wordprocessingShape" mc:Ignorable="w14 w15 w16se w16cid w16 w16cex w16sdtdh w16sdtfl w16du wp14">
+<w:ftr xmlns:wpc="http://schemas.microsoft.com/office/word/2010/wordprocessingCanvas" xmlns:cx="http://schemas.microsoft.com/office/drawing/2014/chartex" xmlns:cx1="http://schemas.microsoft.com/office/drawing/2015/9/8/chartex" xmlns:cx2="http://schemas.microsoft.com/office/drawing/2015/10/21/chartex" xmlns:cx3="http://schemas.microsoft.com/office/drawing/2016/5/9/chartex" xmlns:cx4="http://schemas.microsoft.com/office/drawing/2016/5/10/chartex" xmlns:cx5="http://schemas.microsoft.com/office/drawing/2016/5/11/chartex" xmlns:cx6="http://schemas.microsoft.com/office/drawing/2016/5/12/chartex" xmlns:cx7="http://schemas.microsoft.com/office/drawing/2016/5/13/chartex" xmlns:cx8="http://schemas.microsoft.com/office/drawing/2016/5/14/chartex" xmlns:mc="http://schemas.openxmlformats.org/markup-compatibility/2006" xmlns:aink="http://schemas.microsoft.com/office/drawing/2016/ink" xmlns:am3d="http://schemas.microsoft.com/office/drawing/2017/model3d" xmlns:o="urn:schemas-microsoft-com:office:office" xmlns:r="http://schemas.openxmlformats.org/officeDocument/2006/relationships" xmlns:m="http://schemas.openxmlformats.org/officeDocument/2006/math" xmlns:v="urn:schemas-microsoft-com:vml" xmlns:wp14="http://schemas.microsoft.com/office/word/2010/wordprocessingDrawing" xmlns:wp="http://schemas.openxmlformats.org/drawingml/2006/wordprocessingDrawing" xmlns:w10="urn:schemas-microsoft-com:office:word" xmlns:w="http://schemas.openxmlformats.org/wordprocessingml/2006/main" xmlns:w14="http://schemas.microsoft.com/office/word/2010/wordml" xmlns:w15="http://schemas.microsoft.com/office/word/2012/wordml" xmlns:w16cex="http://schemas.microsoft.com/office/word/2018/wordml/cex" xmlns:w16cid="http://schemas.microsoft.com/office/word/2016/wordml/cid" xmlns:w16="http://schemas.microsoft.com/office/word/2018/wordml" xmlns:w16sdtdh="http://schemas.microsoft.com/office/word/2020/wordml/sdtdatahash" xmlns:w16se="http://schemas.microsoft.com/office/word/2015/wordml/symex" xmlns:wpg="http://schemas.microsoft.com/office/word/2010/wordprocessingGroup" xmlns:wpi="http://schemas.microsoft.com/office/word/2010/wordprocessingInk" xmlns:wne="http://schemas.microsoft.com/office/word/2006/wordml" xmlns:wps="http://schemas.microsoft.com/office/word/2010/wordprocessingShape" mc:Ignorable="w14 w15 w16se w16cid w16 w16cex w16sdtdh wp14">
   <w:sdt>
     <w:sdtPr>
       <w:id w:val="1747759635"/>
@@ -9120,6 +9262,7 @@
         <w:docPartUnique/>
       </w:docPartObj>
     </w:sdtPr>
+    <w:sdtEndPr/>
     <w:sdtContent>
       <w:p>
         <w:pPr>
@@ -9156,7 +9299,7 @@
 </file>
 
 <file path=word/footnotes.xml><?xml version="1.0" encoding="utf-8"?>
-<w:footnotes xmlns:wpc="http://schemas.microsoft.com/office/word/2010/wordprocessingCanvas" xmlns:cx="http://schemas.microsoft.com/office/drawing/2014/chartex" xmlns:cx1="http://schemas.microsoft.com/office/drawing/2015/9/8/chartex" xmlns:cx2="http://schemas.microsoft.com/office/drawing/2015/10/21/chartex" xmlns:cx3="http://schemas.microsoft.com/office/drawing/2016/5/9/chartex" xmlns:cx4="http://schemas.microsoft.com/office/drawing/2016/5/10/chartex" xmlns:cx5="http://schemas.microsoft.com/office/drawing/2016/5/11/chartex" xmlns:cx6="http://schemas.microsoft.com/office/drawing/2016/5/12/chartex" xmlns:cx7="http://schemas.microsoft.com/office/drawing/2016/5/13/chartex" xmlns:cx8="http://schemas.microsoft.com/office/drawing/2016/5/14/chartex" xmlns:mc="http://schemas.openxmlformats.org/markup-compatibility/2006" xmlns:aink="http://schemas.microsoft.com/office/drawing/2016/ink" xmlns:am3d="http://schemas.microsoft.com/office/drawing/2017/model3d" xmlns:o="urn:schemas-microsoft-com:office:office" xmlns:oel="http://schemas.microsoft.com/office/2019/extlst" xmlns:r="http://schemas.openxmlformats.org/officeDocument/2006/relationships" xmlns:m="http://schemas.openxmlformats.org/officeDocument/2006/math" xmlns:v="urn:schemas-microsoft-com:vml" xmlns:wp14="http://schemas.microsoft.com/office/word/2010/wordprocessingDrawing" xmlns:wp="http://schemas.openxmlformats.org/drawingml/2006/wordprocessingDrawing" xmlns:w10="urn:schemas-microsoft-com:office:word" xmlns:w="http://schemas.openxmlformats.org/wordprocessingml/2006/main" xmlns:w14="http://schemas.microsoft.com/office/word/2010/wordml" xmlns:w15="http://schemas.microsoft.com/office/word/2012/wordml" xmlns:w16cex="http://schemas.microsoft.com/office/word/2018/wordml/cex" xmlns:w16cid="http://schemas.microsoft.com/office/word/2016/wordml/cid" xmlns:w16="http://schemas.microsoft.com/office/word/2018/wordml" xmlns:w16du="http://schemas.microsoft.com/office/word/2023/wordml/word16du" xmlns:w16sdtdh="http://schemas.microsoft.com/office/word/2020/wordml/sdtdatahash" xmlns:w16sdtfl="http://schemas.microsoft.com/office/word/2024/wordml/sdtformatlock" xmlns:w16se="http://schemas.microsoft.com/office/word/2015/wordml/symex" xmlns:wpg="http://schemas.microsoft.com/office/word/2010/wordprocessingGroup" xmlns:wpi="http://schemas.microsoft.com/office/word/2010/wordprocessingInk" xmlns:wne="http://schemas.microsoft.com/office/word/2006/wordml" xmlns:wps="http://schemas.microsoft.com/office/word/2010/wordprocessingShape" mc:Ignorable="w14 w15 w16se w16cid w16 w16cex w16sdtdh w16sdtfl w16du wp14">
+<w:footnotes xmlns:wpc="http://schemas.microsoft.com/office/word/2010/wordprocessingCanvas" xmlns:cx="http://schemas.microsoft.com/office/drawing/2014/chartex" xmlns:cx1="http://schemas.microsoft.com/office/drawing/2015/9/8/chartex" xmlns:cx2="http://schemas.microsoft.com/office/drawing/2015/10/21/chartex" xmlns:cx3="http://schemas.microsoft.com/office/drawing/2016/5/9/chartex" xmlns:cx4="http://schemas.microsoft.com/office/drawing/2016/5/10/chartex" xmlns:cx5="http://schemas.microsoft.com/office/drawing/2016/5/11/chartex" xmlns:cx6="http://schemas.microsoft.com/office/drawing/2016/5/12/chartex" xmlns:cx7="http://schemas.microsoft.com/office/drawing/2016/5/13/chartex" xmlns:cx8="http://schemas.microsoft.com/office/drawing/2016/5/14/chartex" xmlns:mc="http://schemas.openxmlformats.org/markup-compatibility/2006" xmlns:aink="http://schemas.microsoft.com/office/drawing/2016/ink" xmlns:am3d="http://schemas.microsoft.com/office/drawing/2017/model3d" xmlns:o="urn:schemas-microsoft-com:office:office" xmlns:r="http://schemas.openxmlformats.org/officeDocument/2006/relationships" xmlns:m="http://schemas.openxmlformats.org/officeDocument/2006/math" xmlns:v="urn:schemas-microsoft-com:vml" xmlns:wp14="http://schemas.microsoft.com/office/word/2010/wordprocessingDrawing" xmlns:wp="http://schemas.openxmlformats.org/drawingml/2006/wordprocessingDrawing" xmlns:w10="urn:schemas-microsoft-com:office:word" xmlns:w="http://schemas.openxmlformats.org/wordprocessingml/2006/main" xmlns:w14="http://schemas.microsoft.com/office/word/2010/wordml" xmlns:w15="http://schemas.microsoft.com/office/word/2012/wordml" xmlns:w16cex="http://schemas.microsoft.com/office/word/2018/wordml/cex" xmlns:w16cid="http://schemas.microsoft.com/office/word/2016/wordml/cid" xmlns:w16="http://schemas.microsoft.com/office/word/2018/wordml" xmlns:w16sdtdh="http://schemas.microsoft.com/office/word/2020/wordml/sdtdatahash" xmlns:w16se="http://schemas.microsoft.com/office/word/2015/wordml/symex" xmlns:wpg="http://schemas.microsoft.com/office/word/2010/wordprocessingGroup" xmlns:wpi="http://schemas.microsoft.com/office/word/2010/wordprocessingInk" xmlns:wne="http://schemas.microsoft.com/office/word/2006/wordml" xmlns:wps="http://schemas.microsoft.com/office/word/2010/wordprocessingShape" mc:Ignorable="w14 w15 w16se w16cid w16 w16cex w16sdtdh wp14">
   <w:footnote w:type="separator" w:id="-1">
     <w:p>
       <w:pPr>
@@ -9181,7 +9324,7 @@
 </file>
 
 <file path=word/header1.xml><?xml version="1.0" encoding="utf-8"?>
-<w:hdr xmlns:wpc="http://schemas.microsoft.com/office/word/2010/wordprocessingCanvas" xmlns:cx="http://schemas.microsoft.com/office/drawing/2014/chartex" xmlns:cx1="http://schemas.microsoft.com/office/drawing/2015/9/8/chartex" xmlns:cx2="http://schemas.microsoft.com/office/drawing/2015/10/21/chartex" xmlns:cx3="http://schemas.microsoft.com/office/drawing/2016/5/9/chartex" xmlns:cx4="http://schemas.microsoft.com/office/drawing/2016/5/10/chartex" xmlns:cx5="http://schemas.microsoft.com/office/drawing/2016/5/11/chartex" xmlns:cx6="http://schemas.microsoft.com/office/drawing/2016/5/12/chartex" xmlns:cx7="http://schemas.microsoft.com/office/drawing/2016/5/13/chartex" xmlns:cx8="http://schemas.microsoft.com/office/drawing/2016/5/14/chartex" xmlns:mc="http://schemas.openxmlformats.org/markup-compatibility/2006" xmlns:aink="http://schemas.microsoft.com/office/drawing/2016/ink" xmlns:am3d="http://schemas.microsoft.com/office/drawing/2017/model3d" xmlns:o="urn:schemas-microsoft-com:office:office" xmlns:oel="http://schemas.microsoft.com/office/2019/extlst" xmlns:r="http://schemas.openxmlformats.org/officeDocument/2006/relationships" xmlns:m="http://schemas.openxmlformats.org/officeDocument/2006/math" xmlns:v="urn:schemas-microsoft-com:vml" xmlns:wp14="http://schemas.microsoft.com/office/word/2010/wordprocessingDrawing" xmlns:wp="http://schemas.openxmlformats.org/drawingml/2006/wordprocessingDrawing" xmlns:w10="urn:schemas-microsoft-com:office:word" xmlns:w="http://schemas.openxmlformats.org/wordprocessingml/2006/main" xmlns:w14="http://schemas.microsoft.com/office/word/2010/wordml" xmlns:w15="http://schemas.microsoft.com/office/word/2012/wordml" xmlns:w16cex="http://schemas.microsoft.com/office/word/2018/wordml/cex" xmlns:w16cid="http://schemas.microsoft.com/office/word/2016/wordml/cid" xmlns:w16="http://schemas.microsoft.com/office/word/2018/wordml" xmlns:w16du="http://schemas.microsoft.com/office/word/2023/wordml/word16du" xmlns:w16sdtdh="http://schemas.microsoft.com/office/word/2020/wordml/sdtdatahash" xmlns:w16sdtfl="http://schemas.microsoft.com/office/word/2024/wordml/sdtformatlock" xmlns:w16se="http://schemas.microsoft.com/office/word/2015/wordml/symex" xmlns:wpg="http://schemas.microsoft.com/office/word/2010/wordprocessingGroup" xmlns:wpi="http://schemas.microsoft.com/office/word/2010/wordprocessingInk" xmlns:wne="http://schemas.microsoft.com/office/word/2006/wordml" xmlns:wps="http://schemas.microsoft.com/office/word/2010/wordprocessingShape" mc:Ignorable="w14 w15 w16se w16cid w16 w16cex w16sdtdh w16sdtfl w16du wp14">
+<w:hdr xmlns:wpc="http://schemas.microsoft.com/office/word/2010/wordprocessingCanvas" xmlns:cx="http://schemas.microsoft.com/office/drawing/2014/chartex" xmlns:cx1="http://schemas.microsoft.com/office/drawing/2015/9/8/chartex" xmlns:cx2="http://schemas.microsoft.com/office/drawing/2015/10/21/chartex" xmlns:cx3="http://schemas.microsoft.com/office/drawing/2016/5/9/chartex" xmlns:cx4="http://schemas.microsoft.com/office/drawing/2016/5/10/chartex" xmlns:cx5="http://schemas.microsoft.com/office/drawing/2016/5/11/chartex" xmlns:cx6="http://schemas.microsoft.com/office/drawing/2016/5/12/chartex" xmlns:cx7="http://schemas.microsoft.com/office/drawing/2016/5/13/chartex" xmlns:cx8="http://schemas.microsoft.com/office/drawing/2016/5/14/chartex" xmlns:mc="http://schemas.openxmlformats.org/markup-compatibility/2006" xmlns:aink="http://schemas.microsoft.com/office/drawing/2016/ink" xmlns:am3d="http://schemas.microsoft.com/office/drawing/2017/model3d" xmlns:o="urn:schemas-microsoft-com:office:office" xmlns:r="http://schemas.openxmlformats.org/officeDocument/2006/relationships" xmlns:m="http://schemas.openxmlformats.org/officeDocument/2006/math" xmlns:v="urn:schemas-microsoft-com:vml" xmlns:wp14="http://schemas.microsoft.com/office/word/2010/wordprocessingDrawing" xmlns:wp="http://schemas.openxmlformats.org/drawingml/2006/wordprocessingDrawing" xmlns:w10="urn:schemas-microsoft-com:office:word" xmlns:w="http://schemas.openxmlformats.org/wordprocessingml/2006/main" xmlns:w14="http://schemas.microsoft.com/office/word/2010/wordml" xmlns:w15="http://schemas.microsoft.com/office/word/2012/wordml" xmlns:w16cex="http://schemas.microsoft.com/office/word/2018/wordml/cex" xmlns:w16cid="http://schemas.microsoft.com/office/word/2016/wordml/cid" xmlns:w16="http://schemas.microsoft.com/office/word/2018/wordml" xmlns:w16sdtdh="http://schemas.microsoft.com/office/word/2020/wordml/sdtdatahash" xmlns:w16se="http://schemas.microsoft.com/office/word/2015/wordml/symex" xmlns:wpg="http://schemas.microsoft.com/office/word/2010/wordprocessingGroup" xmlns:wpi="http://schemas.microsoft.com/office/word/2010/wordprocessingInk" xmlns:wne="http://schemas.microsoft.com/office/word/2006/wordml" xmlns:wps="http://schemas.microsoft.com/office/word/2010/wordprocessingShape" mc:Ignorable="w14 w15 w16se w16cid w16 w16cex w16sdtdh wp14">
   <w:p>
     <w:pPr>
       <w:pStyle w:val="Encabezado"/>
@@ -9212,7 +9355,7 @@
 </file>
 
 <file path=word/numbering.xml><?xml version="1.0" encoding="utf-8"?>
-<w:numbering xmlns:wpc="http://schemas.microsoft.com/office/word/2010/wordprocessingCanvas" xmlns:cx="http://schemas.microsoft.com/office/drawing/2014/chartex" xmlns:cx1="http://schemas.microsoft.com/office/drawing/2015/9/8/chartex" xmlns:cx2="http://schemas.microsoft.com/office/drawing/2015/10/21/chartex" xmlns:cx3="http://schemas.microsoft.com/office/drawing/2016/5/9/chartex" xmlns:cx4="http://schemas.microsoft.com/office/drawing/2016/5/10/chartex" xmlns:cx5="http://schemas.microsoft.com/office/drawing/2016/5/11/chartex" xmlns:cx6="http://schemas.microsoft.com/office/drawing/2016/5/12/chartex" xmlns:cx7="http://schemas.microsoft.com/office/drawing/2016/5/13/chartex" xmlns:cx8="http://schemas.microsoft.com/office/drawing/2016/5/14/chartex" xmlns:mc="http://schemas.openxmlformats.org/markup-compatibility/2006" xmlns:aink="http://schemas.microsoft.com/office/drawing/2016/ink" xmlns:am3d="http://schemas.microsoft.com/office/drawing/2017/model3d" xmlns:o="urn:schemas-microsoft-com:office:office" xmlns:oel="http://schemas.microsoft.com/office/2019/extlst" xmlns:r="http://schemas.openxmlformats.org/officeDocument/2006/relationships" xmlns:m="http://schemas.openxmlformats.org/officeDocument/2006/math" xmlns:v="urn:schemas-microsoft-com:vml" xmlns:wp14="http://schemas.microsoft.com/office/word/2010/wordprocessingDrawing" xmlns:wp="http://schemas.openxmlformats.org/drawingml/2006/wordprocessingDrawing" xmlns:w10="urn:schemas-microsoft-com:office:word" xmlns:w="http://schemas.openxmlformats.org/wordprocessingml/2006/main" xmlns:w14="http://schemas.microsoft.com/office/word/2010/wordml" xmlns:w15="http://schemas.microsoft.com/office/word/2012/wordml" xmlns:w16cex="http://schemas.microsoft.com/office/word/2018/wordml/cex" xmlns:w16cid="http://schemas.microsoft.com/office/word/2016/wordml/cid" xmlns:w16="http://schemas.microsoft.com/office/word/2018/wordml" xmlns:w16du="http://schemas.microsoft.com/office/word/2023/wordml/word16du" xmlns:w16sdtdh="http://schemas.microsoft.com/office/word/2020/wordml/sdtdatahash" xmlns:w16sdtfl="http://schemas.microsoft.com/office/word/2024/wordml/sdtformatlock" xmlns:w16se="http://schemas.microsoft.com/office/word/2015/wordml/symex" xmlns:wpg="http://schemas.microsoft.com/office/word/2010/wordprocessingGroup" xmlns:wpi="http://schemas.microsoft.com/office/word/2010/wordprocessingInk" xmlns:wne="http://schemas.microsoft.com/office/word/2006/wordml" xmlns:wps="http://schemas.microsoft.com/office/word/2010/wordprocessingShape" mc:Ignorable="w14 w15 w16se w16cid w16 w16cex w16sdtdh w16sdtfl w16du wp14">
+<w:numbering xmlns:wpc="http://schemas.microsoft.com/office/word/2010/wordprocessingCanvas" xmlns:cx="http://schemas.microsoft.com/office/drawing/2014/chartex" xmlns:cx1="http://schemas.microsoft.com/office/drawing/2015/9/8/chartex" xmlns:cx2="http://schemas.microsoft.com/office/drawing/2015/10/21/chartex" xmlns:cx3="http://schemas.microsoft.com/office/drawing/2016/5/9/chartex" xmlns:cx4="http://schemas.microsoft.com/office/drawing/2016/5/10/chartex" xmlns:cx5="http://schemas.microsoft.com/office/drawing/2016/5/11/chartex" xmlns:cx6="http://schemas.microsoft.com/office/drawing/2016/5/12/chartex" xmlns:cx7="http://schemas.microsoft.com/office/drawing/2016/5/13/chartex" xmlns:cx8="http://schemas.microsoft.com/office/drawing/2016/5/14/chartex" xmlns:mc="http://schemas.openxmlformats.org/markup-compatibility/2006" xmlns:aink="http://schemas.microsoft.com/office/drawing/2016/ink" xmlns:am3d="http://schemas.microsoft.com/office/drawing/2017/model3d" xmlns:o="urn:schemas-microsoft-com:office:office" xmlns:r="http://schemas.openxmlformats.org/officeDocument/2006/relationships" xmlns:m="http://schemas.openxmlformats.org/officeDocument/2006/math" xmlns:v="urn:schemas-microsoft-com:vml" xmlns:wp14="http://schemas.microsoft.com/office/word/2010/wordprocessingDrawing" xmlns:wp="http://schemas.openxmlformats.org/drawingml/2006/wordprocessingDrawing" xmlns:w10="urn:schemas-microsoft-com:office:word" xmlns:w="http://schemas.openxmlformats.org/wordprocessingml/2006/main" xmlns:w14="http://schemas.microsoft.com/office/word/2010/wordml" xmlns:w15="http://schemas.microsoft.com/office/word/2012/wordml" xmlns:w16cex="http://schemas.microsoft.com/office/word/2018/wordml/cex" xmlns:w16cid="http://schemas.microsoft.com/office/word/2016/wordml/cid" xmlns:w16="http://schemas.microsoft.com/office/word/2018/wordml" xmlns:w16sdtdh="http://schemas.microsoft.com/office/word/2020/wordml/sdtdatahash" xmlns:w16se="http://schemas.microsoft.com/office/word/2015/wordml/symex" xmlns:wpg="http://schemas.microsoft.com/office/word/2010/wordprocessingGroup" xmlns:wpi="http://schemas.microsoft.com/office/word/2010/wordprocessingInk" xmlns:wne="http://schemas.microsoft.com/office/word/2006/wordml" xmlns:wps="http://schemas.microsoft.com/office/word/2010/wordprocessingShape" mc:Ignorable="w14 w15 w16se w16cid w16 w16cex w16sdtdh wp14">
   <w:abstractNum w:abstractNumId="0" w15:restartNumberingAfterBreak="0">
     <w:nsid w:val="022E3F1B"/>
     <w:multiLevelType w:val="multilevel"/>
@@ -10772,80 +10915,80 @@
       </w:pPr>
     </w:lvl>
   </w:abstractNum>
-  <w:num w:numId="1" w16cid:durableId="1845851913">
+  <w:num w:numId="1">
     <w:abstractNumId w:val="5"/>
   </w:num>
-  <w:num w:numId="2" w16cid:durableId="1665233539">
+  <w:num w:numId="2">
     <w:abstractNumId w:val="14"/>
   </w:num>
-  <w:num w:numId="3" w16cid:durableId="810630790">
+  <w:num w:numId="3">
     <w:abstractNumId w:val="9"/>
   </w:num>
-  <w:num w:numId="4" w16cid:durableId="2098288736">
+  <w:num w:numId="4">
     <w:abstractNumId w:val="6"/>
   </w:num>
-  <w:num w:numId="5" w16cid:durableId="1474443829">
+  <w:num w:numId="5">
     <w:abstractNumId w:val="5"/>
   </w:num>
-  <w:num w:numId="6" w16cid:durableId="182473270">
+  <w:num w:numId="6">
     <w:abstractNumId w:val="1"/>
   </w:num>
-  <w:num w:numId="7" w16cid:durableId="1529104385">
+  <w:num w:numId="7">
     <w:abstractNumId w:val="12"/>
   </w:num>
-  <w:num w:numId="8" w16cid:durableId="2063478049">
+  <w:num w:numId="8">
     <w:abstractNumId w:val="7"/>
   </w:num>
-  <w:num w:numId="9" w16cid:durableId="379549842">
+  <w:num w:numId="9">
     <w:abstractNumId w:val="15"/>
   </w:num>
-  <w:num w:numId="10" w16cid:durableId="1826820321">
+  <w:num w:numId="10">
     <w:abstractNumId w:val="0"/>
   </w:num>
-  <w:num w:numId="11" w16cid:durableId="452869519">
+  <w:num w:numId="11">
     <w:abstractNumId w:val="13"/>
   </w:num>
-  <w:num w:numId="12" w16cid:durableId="1148664184">
+  <w:num w:numId="12">
     <w:abstractNumId w:val="16"/>
   </w:num>
-  <w:num w:numId="13" w16cid:durableId="1327897580">
+  <w:num w:numId="13">
     <w:abstractNumId w:val="2"/>
   </w:num>
-  <w:num w:numId="14" w16cid:durableId="330372692">
+  <w:num w:numId="14">
     <w:abstractNumId w:val="11"/>
   </w:num>
-  <w:num w:numId="15" w16cid:durableId="1067073794">
+  <w:num w:numId="15">
     <w:abstractNumId w:val="2"/>
   </w:num>
-  <w:num w:numId="16" w16cid:durableId="932206638">
+  <w:num w:numId="16">
     <w:abstractNumId w:val="2"/>
   </w:num>
-  <w:num w:numId="17" w16cid:durableId="377819498">
+  <w:num w:numId="17">
     <w:abstractNumId w:val="2"/>
   </w:num>
-  <w:num w:numId="18" w16cid:durableId="2019112455">
+  <w:num w:numId="18">
     <w:abstractNumId w:val="4"/>
   </w:num>
-  <w:num w:numId="19" w16cid:durableId="131872774">
+  <w:num w:numId="19">
     <w:abstractNumId w:val="3"/>
   </w:num>
-  <w:num w:numId="20" w16cid:durableId="688288603">
+  <w:num w:numId="20">
     <w:abstractNumId w:val="10"/>
   </w:num>
-  <w:num w:numId="21" w16cid:durableId="605582797">
+  <w:num w:numId="21">
     <w:abstractNumId w:val="10"/>
     <w:lvlOverride w:ilvl="0">
       <w:startOverride w:val="1"/>
     </w:lvlOverride>
   </w:num>
-  <w:num w:numId="22" w16cid:durableId="938758370">
+  <w:num w:numId="22">
     <w:abstractNumId w:val="8"/>
   </w:num>
 </w:numbering>
 </file>
 
 <file path=word/styles.xml><?xml version="1.0" encoding="utf-8"?>
-<w:styles xmlns:mc="http://schemas.openxmlformats.org/markup-compatibility/2006" xmlns:r="http://schemas.openxmlformats.org/officeDocument/2006/relationships" xmlns:w="http://schemas.openxmlformats.org/wordprocessingml/2006/main" xmlns:w14="http://schemas.microsoft.com/office/word/2010/wordml" xmlns:w15="http://schemas.microsoft.com/office/word/2012/wordml" xmlns:w16cex="http://schemas.microsoft.com/office/word/2018/wordml/cex" xmlns:w16cid="http://schemas.microsoft.com/office/word/2016/wordml/cid" xmlns:w16="http://schemas.microsoft.com/office/word/2018/wordml" xmlns:w16du="http://schemas.microsoft.com/office/word/2023/wordml/word16du" xmlns:w16sdtdh="http://schemas.microsoft.com/office/word/2020/wordml/sdtdatahash" xmlns:w16sdtfl="http://schemas.microsoft.com/office/word/2024/wordml/sdtformatlock" xmlns:w16se="http://schemas.microsoft.com/office/word/2015/wordml/symex" mc:Ignorable="w14 w15 w16se w16cid w16 w16cex w16sdtdh w16sdtfl w16du">
+<w:styles xmlns:mc="http://schemas.openxmlformats.org/markup-compatibility/2006" xmlns:r="http://schemas.openxmlformats.org/officeDocument/2006/relationships" xmlns:w="http://schemas.openxmlformats.org/wordprocessingml/2006/main" xmlns:w14="http://schemas.microsoft.com/office/word/2010/wordml" xmlns:w15="http://schemas.microsoft.com/office/word/2012/wordml" xmlns:w16cex="http://schemas.microsoft.com/office/word/2018/wordml/cex" xmlns:w16cid="http://schemas.microsoft.com/office/word/2016/wordml/cid" xmlns:w16="http://schemas.microsoft.com/office/word/2018/wordml" xmlns:w16sdtdh="http://schemas.microsoft.com/office/word/2020/wordml/sdtdatahash" xmlns:w16se="http://schemas.microsoft.com/office/word/2015/wordml/symex" mc:Ignorable="w14 w15 w16se w16cid w16 w16cex w16sdtdh">
   <w:docDefaults>
     <w:rPrDefault>
       <w:rPr>
@@ -11481,6 +11624,7 @@
   <w:style w:type="character" w:default="1" w:styleId="Fuentedeprrafopredeter">
     <w:name w:val="Default Paragraph Font"/>
     <w:uiPriority w:val="1"/>
+    <w:semiHidden/>
     <w:unhideWhenUsed/>
   </w:style>
   <w:style w:type="table" w:default="1" w:styleId="Tablanormal">
@@ -12151,7 +12295,7 @@
 </file>
 
 <file path=word/glossary/document.xml><?xml version="1.0" encoding="utf-8"?>
-<w:glossaryDocument xmlns:wpc="http://schemas.microsoft.com/office/word/2010/wordprocessingCanvas" xmlns:cx="http://schemas.microsoft.com/office/drawing/2014/chartex" xmlns:cx1="http://schemas.microsoft.com/office/drawing/2015/9/8/chartex" xmlns:cx2="http://schemas.microsoft.com/office/drawing/2015/10/21/chartex" xmlns:cx3="http://schemas.microsoft.com/office/drawing/2016/5/9/chartex" xmlns:cx4="http://schemas.microsoft.com/office/drawing/2016/5/10/chartex" xmlns:cx5="http://schemas.microsoft.com/office/drawing/2016/5/11/chartex" xmlns:cx6="http://schemas.microsoft.com/office/drawing/2016/5/12/chartex" xmlns:cx7="http://schemas.microsoft.com/office/drawing/2016/5/13/chartex" xmlns:cx8="http://schemas.microsoft.com/office/drawing/2016/5/14/chartex" xmlns:mc="http://schemas.openxmlformats.org/markup-compatibility/2006" xmlns:aink="http://schemas.microsoft.com/office/drawing/2016/ink" xmlns:am3d="http://schemas.microsoft.com/office/drawing/2017/model3d" xmlns:o="urn:schemas-microsoft-com:office:office" xmlns:oel="http://schemas.microsoft.com/office/2019/extlst" xmlns:r="http://schemas.openxmlformats.org/officeDocument/2006/relationships" xmlns:m="http://schemas.openxmlformats.org/officeDocument/2006/math" xmlns:v="urn:schemas-microsoft-com:vml" xmlns:wp14="http://schemas.microsoft.com/office/word/2010/wordprocessingDrawing" xmlns:wp="http://schemas.openxmlformats.org/drawingml/2006/wordprocessingDrawing" xmlns:w10="urn:schemas-microsoft-com:office:word" xmlns:w="http://schemas.openxmlformats.org/wordprocessingml/2006/main" xmlns:w14="http://schemas.microsoft.com/office/word/2010/wordml" xmlns:w15="http://schemas.microsoft.com/office/word/2012/wordml" xmlns:w16cex="http://schemas.microsoft.com/office/word/2018/wordml/cex" xmlns:w16cid="http://schemas.microsoft.com/office/word/2016/wordml/cid" xmlns:w16="http://schemas.microsoft.com/office/word/2018/wordml" xmlns:w16du="http://schemas.microsoft.com/office/word/2023/wordml/word16du" xmlns:w16sdtdh="http://schemas.microsoft.com/office/word/2020/wordml/sdtdatahash" xmlns:w16sdtfl="http://schemas.microsoft.com/office/word/2024/wordml/sdtformatlock" xmlns:w16se="http://schemas.microsoft.com/office/word/2015/wordml/symex" xmlns:wpg="http://schemas.microsoft.com/office/word/2010/wordprocessingGroup" xmlns:wpi="http://schemas.microsoft.com/office/word/2010/wordprocessingInk" xmlns:wne="http://schemas.microsoft.com/office/word/2006/wordml" xmlns:wps="http://schemas.microsoft.com/office/word/2010/wordprocessingShape" mc:Ignorable="w14 w15 w16se w16cid w16 w16cex w16sdtdh w16sdtfl w16du wp14">
+<w:glossaryDocument xmlns:wpc="http://schemas.microsoft.com/office/word/2010/wordprocessingCanvas" xmlns:cx="http://schemas.microsoft.com/office/drawing/2014/chartex" xmlns:cx1="http://schemas.microsoft.com/office/drawing/2015/9/8/chartex" xmlns:cx2="http://schemas.microsoft.com/office/drawing/2015/10/21/chartex" xmlns:cx3="http://schemas.microsoft.com/office/drawing/2016/5/9/chartex" xmlns:cx4="http://schemas.microsoft.com/office/drawing/2016/5/10/chartex" xmlns:cx5="http://schemas.microsoft.com/office/drawing/2016/5/11/chartex" xmlns:cx6="http://schemas.microsoft.com/office/drawing/2016/5/12/chartex" xmlns:cx7="http://schemas.microsoft.com/office/drawing/2016/5/13/chartex" xmlns:cx8="http://schemas.microsoft.com/office/drawing/2016/5/14/chartex" xmlns:mc="http://schemas.openxmlformats.org/markup-compatibility/2006" xmlns:aink="http://schemas.microsoft.com/office/drawing/2016/ink" xmlns:am3d="http://schemas.microsoft.com/office/drawing/2017/model3d" xmlns:o="urn:schemas-microsoft-com:office:office" xmlns:r="http://schemas.openxmlformats.org/officeDocument/2006/relationships" xmlns:m="http://schemas.openxmlformats.org/officeDocument/2006/math" xmlns:v="urn:schemas-microsoft-com:vml" xmlns:wp14="http://schemas.microsoft.com/office/word/2010/wordprocessingDrawing" xmlns:wp="http://schemas.openxmlformats.org/drawingml/2006/wordprocessingDrawing" xmlns:w10="urn:schemas-microsoft-com:office:word" xmlns:w="http://schemas.openxmlformats.org/wordprocessingml/2006/main" xmlns:w14="http://schemas.microsoft.com/office/word/2010/wordml" xmlns:w15="http://schemas.microsoft.com/office/word/2012/wordml" xmlns:w16cex="http://schemas.microsoft.com/office/word/2018/wordml/cex" xmlns:w16cid="http://schemas.microsoft.com/office/word/2016/wordml/cid" xmlns:w16="http://schemas.microsoft.com/office/word/2018/wordml" xmlns:w16sdtdh="http://schemas.microsoft.com/office/word/2020/wordml/sdtdatahash" xmlns:w16se="http://schemas.microsoft.com/office/word/2015/wordml/symex" xmlns:wpg="http://schemas.microsoft.com/office/word/2010/wordprocessingGroup" xmlns:wpi="http://schemas.microsoft.com/office/word/2010/wordprocessingInk" xmlns:wne="http://schemas.microsoft.com/office/word/2006/wordml" xmlns:wps="http://schemas.microsoft.com/office/word/2010/wordprocessingShape" mc:Ignorable="w14 w15 w16se w16cid w16 w16cex w16sdtdh wp14">
   <w:docParts>
     <w:docPart>
       <w:docPartPr>
@@ -12300,7 +12444,7 @@
 </file>
 
 <file path=word/glossary/fontTable.xml><?xml version="1.0" encoding="utf-8"?>
-<w:fonts xmlns:mc="http://schemas.openxmlformats.org/markup-compatibility/2006" xmlns:r="http://schemas.openxmlformats.org/officeDocument/2006/relationships" xmlns:w="http://schemas.openxmlformats.org/wordprocessingml/2006/main" xmlns:w14="http://schemas.microsoft.com/office/word/2010/wordml" xmlns:w15="http://schemas.microsoft.com/office/word/2012/wordml" xmlns:w16cex="http://schemas.microsoft.com/office/word/2018/wordml/cex" xmlns:w16cid="http://schemas.microsoft.com/office/word/2016/wordml/cid" xmlns:w16="http://schemas.microsoft.com/office/word/2018/wordml" xmlns:w16du="http://schemas.microsoft.com/office/word/2023/wordml/word16du" xmlns:w16sdtdh="http://schemas.microsoft.com/office/word/2020/wordml/sdtdatahash" xmlns:w16sdtfl="http://schemas.microsoft.com/office/word/2024/wordml/sdtformatlock" xmlns:w16se="http://schemas.microsoft.com/office/word/2015/wordml/symex" mc:Ignorable="w14 w15 w16se w16cid w16 w16cex w16sdtdh w16sdtfl w16du">
+<w:fonts xmlns:mc="http://schemas.openxmlformats.org/markup-compatibility/2006" xmlns:r="http://schemas.openxmlformats.org/officeDocument/2006/relationships" xmlns:w="http://schemas.openxmlformats.org/wordprocessingml/2006/main" xmlns:w14="http://schemas.microsoft.com/office/word/2010/wordml" xmlns:w15="http://schemas.microsoft.com/office/word/2012/wordml" xmlns:w16cex="http://schemas.microsoft.com/office/word/2018/wordml/cex" xmlns:w16cid="http://schemas.microsoft.com/office/word/2016/wordml/cid" xmlns:w16="http://schemas.microsoft.com/office/word/2018/wordml" xmlns:w16sdtdh="http://schemas.microsoft.com/office/word/2020/wordml/sdtdatahash" xmlns:w16se="http://schemas.microsoft.com/office/word/2015/wordml/symex" mc:Ignorable="w14 w15 w16se w16cid w16 w16cex w16sdtdh">
   <w:font w:name="Times New Roman">
     <w:panose1 w:val="02020603050405020304"/>
     <w:charset w:val="00"/>
@@ -12366,6 +12510,7 @@
     <w:sig w:usb0="E4002EFF" w:usb1="C000E47F" w:usb2="00000009" w:usb3="00000000" w:csb0="000001FF" w:csb1="00000000"/>
   </w:font>
   <w:font w:name="MS Mincho">
+    <w:altName w:val="ＭＳ 明朝"/>
     <w:panose1 w:val="02020609040205080304"/>
     <w:charset w:val="80"/>
     <w:family w:val="modern"/>
@@ -12390,7 +12535,7 @@
 </file>
 
 <file path=word/glossary/settings.xml><?xml version="1.0" encoding="utf-8"?>
-<w:settings xmlns:mc="http://schemas.openxmlformats.org/markup-compatibility/2006" xmlns:o="urn:schemas-microsoft-com:office:office" xmlns:r="http://schemas.openxmlformats.org/officeDocument/2006/relationships" xmlns:m="http://schemas.openxmlformats.org/officeDocument/2006/math" xmlns:v="urn:schemas-microsoft-com:vml" xmlns:w10="urn:schemas-microsoft-com:office:word" xmlns:w="http://schemas.openxmlformats.org/wordprocessingml/2006/main" xmlns:w14="http://schemas.microsoft.com/office/word/2010/wordml" xmlns:w15="http://schemas.microsoft.com/office/word/2012/wordml" xmlns:w16cex="http://schemas.microsoft.com/office/word/2018/wordml/cex" xmlns:w16cid="http://schemas.microsoft.com/office/word/2016/wordml/cid" xmlns:w16="http://schemas.microsoft.com/office/word/2018/wordml" xmlns:w16du="http://schemas.microsoft.com/office/word/2023/wordml/word16du" xmlns:w16sdtdh="http://schemas.microsoft.com/office/word/2020/wordml/sdtdatahash" xmlns:w16sdtfl="http://schemas.microsoft.com/office/word/2024/wordml/sdtformatlock" xmlns:w16se="http://schemas.microsoft.com/office/word/2015/wordml/symex" xmlns:sl="http://schemas.openxmlformats.org/schemaLibrary/2006/main" mc:Ignorable="w14 w15 w16se w16cid w16 w16cex w16sdtdh w16sdtfl w16du">
+<w:settings xmlns:mc="http://schemas.openxmlformats.org/markup-compatibility/2006" xmlns:o="urn:schemas-microsoft-com:office:office" xmlns:r="http://schemas.openxmlformats.org/officeDocument/2006/relationships" xmlns:m="http://schemas.openxmlformats.org/officeDocument/2006/math" xmlns:v="urn:schemas-microsoft-com:vml" xmlns:w10="urn:schemas-microsoft-com:office:word" xmlns:w="http://schemas.openxmlformats.org/wordprocessingml/2006/main" xmlns:w14="http://schemas.microsoft.com/office/word/2010/wordml" xmlns:w15="http://schemas.microsoft.com/office/word/2012/wordml" xmlns:w16cex="http://schemas.microsoft.com/office/word/2018/wordml/cex" xmlns:w16cid="http://schemas.microsoft.com/office/word/2016/wordml/cid" xmlns:w16="http://schemas.microsoft.com/office/word/2018/wordml" xmlns:w16sdtdh="http://schemas.microsoft.com/office/word/2020/wordml/sdtdatahash" xmlns:w16se="http://schemas.microsoft.com/office/word/2015/wordml/symex" xmlns:sl="http://schemas.openxmlformats.org/schemaLibrary/2006/main" mc:Ignorable="w14 w15 w16se w16cid w16 w16cex w16sdtdh">
   <w:view w:val="normal"/>
   <w:defaultTabStop w:val="708"/>
   <w:hyphenationZone w:val="425"/>
@@ -12416,6 +12561,7 @@
     <w:rsid w:val="00567091"/>
     <w:rsid w:val="00573465"/>
     <w:rsid w:val="005D0A02"/>
+    <w:rsid w:val="00604825"/>
     <w:rsid w:val="00624C4F"/>
     <w:rsid w:val="006D10FA"/>
     <w:rsid w:val="006D4367"/>
@@ -12435,6 +12581,7 @@
     <w:rsid w:val="00EC69FB"/>
     <w:rsid w:val="00F34390"/>
     <w:rsid w:val="00F35299"/>
+    <w:rsid w:val="00F94ABE"/>
   </w:rsids>
   <m:mathPr>
     <m:mathFont m:val="Cambria Math"/>
@@ -12458,7 +12605,7 @@
 </file>
 
 <file path=word/glossary/styles.xml><?xml version="1.0" encoding="utf-8"?>
-<w:styles xmlns:mc="http://schemas.openxmlformats.org/markup-compatibility/2006" xmlns:r="http://schemas.openxmlformats.org/officeDocument/2006/relationships" xmlns:w="http://schemas.openxmlformats.org/wordprocessingml/2006/main" xmlns:w14="http://schemas.microsoft.com/office/word/2010/wordml" xmlns:w15="http://schemas.microsoft.com/office/word/2012/wordml" xmlns:w16cex="http://schemas.microsoft.com/office/word/2018/wordml/cex" xmlns:w16cid="http://schemas.microsoft.com/office/word/2016/wordml/cid" xmlns:w16="http://schemas.microsoft.com/office/word/2018/wordml" xmlns:w16du="http://schemas.microsoft.com/office/word/2023/wordml/word16du" xmlns:w16sdtdh="http://schemas.microsoft.com/office/word/2020/wordml/sdtdatahash" xmlns:w16sdtfl="http://schemas.microsoft.com/office/word/2024/wordml/sdtformatlock" xmlns:w16se="http://schemas.microsoft.com/office/word/2015/wordml/symex" mc:Ignorable="w14 w15 w16se w16cid w16 w16cex w16sdtdh w16sdtfl w16du">
+<w:styles xmlns:mc="http://schemas.openxmlformats.org/markup-compatibility/2006" xmlns:r="http://schemas.openxmlformats.org/officeDocument/2006/relationships" xmlns:w="http://schemas.openxmlformats.org/wordprocessingml/2006/main" xmlns:w14="http://schemas.microsoft.com/office/word/2010/wordml" xmlns:w15="http://schemas.microsoft.com/office/word/2012/wordml" xmlns:w16cex="http://schemas.microsoft.com/office/word/2018/wordml/cex" xmlns:w16cid="http://schemas.microsoft.com/office/word/2016/wordml/cid" xmlns:w16="http://schemas.microsoft.com/office/word/2018/wordml" xmlns:w16sdtdh="http://schemas.microsoft.com/office/word/2020/wordml/sdtdatahash" xmlns:w16se="http://schemas.microsoft.com/office/word/2015/wordml/symex" mc:Ignorable="w14 w15 w16se w16cid w16 w16cex w16sdtdh">
   <w:docDefaults>
     <w:rPrDefault>
       <w:rPr>
@@ -12939,7 +13086,7 @@
 </file>
 
 <file path=word/glossary/webSettings.xml><?xml version="1.0" encoding="utf-8"?>
-<w:webSettings xmlns:mc="http://schemas.openxmlformats.org/markup-compatibility/2006" xmlns:r="http://schemas.openxmlformats.org/officeDocument/2006/relationships" xmlns:w="http://schemas.openxmlformats.org/wordprocessingml/2006/main" xmlns:w14="http://schemas.microsoft.com/office/word/2010/wordml" xmlns:w15="http://schemas.microsoft.com/office/word/2012/wordml" xmlns:w16cex="http://schemas.microsoft.com/office/word/2018/wordml/cex" xmlns:w16cid="http://schemas.microsoft.com/office/word/2016/wordml/cid" xmlns:w16="http://schemas.microsoft.com/office/word/2018/wordml" xmlns:w16du="http://schemas.microsoft.com/office/word/2023/wordml/word16du" xmlns:w16sdtdh="http://schemas.microsoft.com/office/word/2020/wordml/sdtdatahash" xmlns:w16sdtfl="http://schemas.microsoft.com/office/word/2024/wordml/sdtformatlock" xmlns:w16se="http://schemas.microsoft.com/office/word/2015/wordml/symex" mc:Ignorable="w14 w15 w16se w16cid w16 w16cex w16sdtdh w16sdtfl w16du">
+<w:webSettings xmlns:mc="http://schemas.openxmlformats.org/markup-compatibility/2006" xmlns:r="http://schemas.openxmlformats.org/officeDocument/2006/relationships" xmlns:w="http://schemas.openxmlformats.org/wordprocessingml/2006/main" xmlns:w14="http://schemas.microsoft.com/office/word/2010/wordml" xmlns:w15="http://schemas.microsoft.com/office/word/2012/wordml" xmlns:w16cex="http://schemas.microsoft.com/office/word/2018/wordml/cex" xmlns:w16cid="http://schemas.microsoft.com/office/word/2016/wordml/cid" xmlns:w16="http://schemas.microsoft.com/office/word/2018/wordml" xmlns:w16sdtdh="http://schemas.microsoft.com/office/word/2020/wordml/sdtdatahash" xmlns:w16se="http://schemas.microsoft.com/office/word/2015/wordml/symex" mc:Ignorable="w14 w15 w16se w16cid w16 w16cex w16sdtdh">
   <w:optimizeForBrowser/>
   <w:allowPNG/>
 </w:webSettings>

</xml_diff>